<commit_message>
docs: update Memory.docx recording Phase 0 completion
</commit_message>
<xml_diff>
--- a/LifeOS_Memory.docx
+++ b/LifeOS_Memory.docx
@@ -16,81 +16,7 @@
         <w:pStyle w:val="FirstParagraph"/>
       </w:pPr>
       <w:r>
-        <w:rPr>
-          <w:bCs/>
-          <w:b/>
-        </w:rPr>
-        <w:t xml:space="preserve">Project Name:</w:t>
-      </w:r>
-      <w:r>
-        <w:t xml:space="preserve"> </w:t>
-      </w:r>
-      <w:r>
-        <w:t xml:space="preserve">LifeOS</w:t>
-      </w:r>
-      <w:r>
-        <w:t xml:space="preserve"> </w:t>
-      </w:r>
-      <w:r>
-        <w:rPr>
-          <w:bCs/>
-          <w:b/>
-        </w:rPr>
-        <w:t xml:space="preserve">Version:</w:t>
-      </w:r>
-      <w:r>
-        <w:t xml:space="preserve"> </w:t>
-      </w:r>
-      <w:r>
-        <w:t xml:space="preserve">1.0</w:t>
-      </w:r>
-      <w:r>
-        <w:t xml:space="preserve"> </w:t>
-      </w:r>
-      <w:r>
-        <w:rPr>
-          <w:bCs/>
-          <w:b/>
-        </w:rPr>
-        <w:t xml:space="preserve">Document Type:</w:t>
-      </w:r>
-      <w:r>
-        <w:t xml:space="preserve"> </w:t>
-      </w:r>
-      <w:r>
-        <w:t xml:space="preserve">Living Project Memory / Development Context</w:t>
-      </w:r>
-      <w:r>
-        <w:t xml:space="preserve"> </w:t>
-      </w:r>
-      <w:r>
-        <w:rPr>
-          <w:bCs/>
-          <w:b/>
-        </w:rPr>
-        <w:t xml:space="preserve">Status:</w:t>
-      </w:r>
-      <w:r>
-        <w:t xml:space="preserve"> </w:t>
-      </w:r>
-      <w:r>
-        <w:t xml:space="preserve">Pre-Development</w:t>
-      </w:r>
-      <w:r>
-        <w:t xml:space="preserve"> </w:t>
-      </w:r>
-      <w:r>
-        <w:rPr>
-          <w:bCs/>
-          <w:b/>
-        </w:rPr>
-        <w:t xml:space="preserve">Last Updated:</w:t>
-      </w:r>
-      <w:r>
-        <w:t xml:space="preserve"> </w:t>
-      </w:r>
-      <w:r>
-        <w:t xml:space="preserve">2026-08-28</w:t>
+        <w:t>Project Name: LifeOS Version: 1.0 Document Type: Living Project Memory / Development Context Status: Development Last Updated: 2026-09-05</w:t>
       </w:r>
     </w:p>
     <w:p>
@@ -5924,17 +5850,7 @@
         <w:pStyle w:val="FirstParagraph"/>
       </w:pPr>
       <w:r>
-        <w:rPr>
-          <w:bCs/>
-          <w:b/>
-        </w:rPr>
-        <w:t xml:space="preserve">Status:</w:t>
-      </w:r>
-      <w:r>
-        <w:t xml:space="preserve"> </w:t>
-      </w:r>
-      <w:r>
-        <w:t xml:space="preserve">NOT STARTED</w:t>
+        <w:t>Status: COMPLETED</w:t>
       </w:r>
     </w:p>
     <w:bookmarkEnd w:id="76"/>
@@ -12672,6 +12588,44 @@
       </w:r>
     </w:p>
     <w:bookmarkEnd w:id="136"/>
+    <w:p>
+      <w:r>
+        <w:t>Session Update — 2026-09-05 (Phase 0 Completion)</w:t>
+      </w:r>
+    </w:p>
+    <w:p>
+      <w:r>
+        <w:t>Date: 2026-09-05</w:t>
+        <w:br/>
+        <w:t>Current Phase: Phase 0 — Project Setup</w:t>
+        <w:br/>
+        <w:t>Work Completed: Full repository scaffolding, mono-repo Git init, Next.js client initialization, Express backend initialization, ESLint flat config on both, Prettier + Tailwind plugin, Husky pre-commit hooks, shadcn/ui setup, all frontend/backend dependencies installed and verified.</w:t>
+        <w:br/>
+        <w:t>Features Implemented: None (Phase 0 infrastructure only per Rule 1).</w:t>
+        <w:br/>
+        <w:t>Files Added: Root .gitignore, .husky/pre-commit, README.md, package.json, lifeos-client/*, lifeos-server/*</w:t>
+        <w:br/>
+        <w:t>Files Modified: package.json (root), tsconfig.json (server), eslint.config.mjs (client, server)</w:t>
+        <w:br/>
+        <w:t>Database Changes: None</w:t>
+        <w:br/>
+        <w:t>API Changes: Added GET /api/health baseline endpoint</w:t>
+        <w:br/>
+        <w:t>UI Changes: Added initial Next.js shell and Button primitive</w:t>
+        <w:br/>
+        <w:t>Tests Added: Baseline health check and build tests</w:t>
+        <w:br/>
+        <w:t>Tests Passed: Client build + lint + format check; Server build + lint + format check + live /api/health check</w:t>
+        <w:br/>
+        <w:t>Known Issues: None</w:t>
+        <w:br/>
+        <w:t>Decisions Made: Decision 007 — Dual directory structure under unified mono-repo with develop branch workflow</w:t>
+        <w:br/>
+        <w:t>Next Step: Phase 1 — Backend Foundation (MongoDB connection, Mongoose config, auth/validation/logging/rate-limit middleware)</w:t>
+        <w:br/>
+        <w:t>Overall Status: Phase 0 COMPLETED. Ready for Phase 1.</w:t>
+      </w:r>
+    </w:p>
     <w:sectPr/>
   </w:body>
 </w:document>

</xml_diff>

<commit_message>
docs: update Memory.docx recording Phase 1 completion
</commit_message>
<xml_diff>
--- a/LifeOS_Memory.docx
+++ b/LifeOS_Memory.docx
@@ -5868,17 +5868,7 @@
         <w:pStyle w:val="FirstParagraph"/>
       </w:pPr>
       <w:r>
-        <w:rPr>
-          <w:bCs/>
-          <w:b/>
-        </w:rPr>
-        <w:t xml:space="preserve">Status:</w:t>
-      </w:r>
-      <w:r>
-        <w:t xml:space="preserve"> </w:t>
-      </w:r>
-      <w:r>
-        <w:t xml:space="preserve">NOT STARTED</w:t>
+        <w:t>Status: COMPLETED</w:t>
       </w:r>
     </w:p>
     <w:bookmarkEnd w:id="77"/>
@@ -12624,6 +12614,64 @@
         <w:t>Next Step: Phase 1 — Backend Foundation (MongoDB connection, Mongoose config, auth/validation/logging/rate-limit middleware)</w:t>
         <w:br/>
         <w:t>Overall Status: Phase 0 COMPLETED. Ready for Phase 1.</w:t>
+      </w:r>
+    </w:p>
+    <w:p>
+      <w:r>
+        <w:t>Session Update — 2026-09-05 (Phase 1 Completion)</w:t>
+      </w:r>
+    </w:p>
+    <w:p>
+      <w:r>
+        <w:t>Date: 2026-09-05</w:t>
+        <w:br/>
+        <w:t>Current Phase: Phase 1 — Backend Foundation</w:t>
+        <w:br/>
+        <w:t>Work Completed: Built full production-ready backend foundation per Architecture.md and Implementation.md Phase 1.</w:t>
+        <w:br/>
+        <w:t xml:space="preserve">  - Zod environment validation (config/env.ts)</w:t>
+        <w:br/>
+        <w:t xml:space="preserve">  - MongoDB connection manager with reconnection events (config/db.ts)</w:t>
+        <w:br/>
+        <w:t xml:space="preserve">  - Standardized JSON envelope and response helpers (utils/response.ts)</w:t>
+        <w:br/>
+        <w:t xml:space="preserve">  - Standardized AppError hierarchy (utils/errors.ts)</w:t>
+        <w:br/>
+        <w:t xml:space="preserve">  - Centralized global error handling middleware (middleware/errorHandler.ts)</w:t>
+        <w:br/>
+        <w:t xml:space="preserve">  - Dual JWT token manager for access and refresh tokens (utils/jwt.ts)</w:t>
+        <w:br/>
+        <w:t xml:space="preserve">  - AuthenticateUser &amp; RequireRoles middleware (middleware/auth.ts)</w:t>
+        <w:br/>
+        <w:t xml:space="preserve">  - Zod Request Validator middleware for body/query/params (middleware/validate.ts)</w:t>
+        <w:br/>
+        <w:t xml:space="preserve">  - Standard &amp; Auth Rate Limiters (middleware/rateLimiter.ts)</w:t>
+        <w:br/>
+        <w:t xml:space="preserve">  - Express app wiring with helmet, cors, morgan, 404 handler, and /api/health</w:t>
+        <w:br/>
+        <w:t>Features Implemented: Backend foundation infrastructure.</w:t>
+        <w:br/>
+        <w:t>Files Added: src/config/env.ts, src/config/db.ts, src/utils/errors.ts, src/utils/response.ts, src/utils/jwt.ts, src/middleware/errorHandler.ts, src/middleware/auth.ts, src/middleware/validate.ts, src/middleware/rateLimiter.ts, src/types/express.d.ts, tests/foundation.test.ts</w:t>
+        <w:br/>
+        <w:t>Files Modified: src/app.ts, src/server.ts, package.json, eslint.config.mjs</w:t>
+        <w:br/>
+        <w:t>Database Changes: Mongoose connection manager initialized; no collections created yet (deferred to Phase 2 per Database First order)</w:t>
+        <w:br/>
+        <w:t>API Changes: Standardized error envelope and 404 response handler wired to all endpoints</w:t>
+        <w:br/>
+        <w:t>UI Changes: None</w:t>
+        <w:br/>
+        <w:t>Tests Added: tests/foundation.test.ts (JWT signing, verification, error throwing, Zod validation)</w:t>
+        <w:br/>
+        <w:t>Tests Passed: 5/5 automated unit tests passing; live server test passing (200 OK and 404 standard envelopes verified)</w:t>
+        <w:br/>
+        <w:t>Known Issues: None</w:t>
+        <w:br/>
+        <w:t>Decisions Made: Decision 008 — Centralized AppError hierarchy and standard JSON envelope enforced at middleware boundary</w:t>
+        <w:br/>
+        <w:t>Next Step: Phase 2 — Authentication Module (User Schema, Model, Repository, Service, Controller, Routes, Frontend Auth)</w:t>
+        <w:br/>
+        <w:t>Overall Status: Phase 1 COMPLETED. Ready for Phase 2.</w:t>
       </w:r>
     </w:p>
     <w:sectPr/>

</xml_diff>

<commit_message>
docs: update Memory.docx recording Phase 2 completion
</commit_message>
<xml_diff>
--- a/LifeOS_Memory.docx
+++ b/LifeOS_Memory.docx
@@ -5886,17 +5886,7 @@
         <w:pStyle w:val="FirstParagraph"/>
       </w:pPr>
       <w:r>
-        <w:rPr>
-          <w:bCs/>
-          <w:b/>
-        </w:rPr>
-        <w:t xml:space="preserve">Status:</w:t>
-      </w:r>
-      <w:r>
-        <w:t xml:space="preserve"> </w:t>
-      </w:r>
-      <w:r>
-        <w:t xml:space="preserve">NOT STARTED</w:t>
+        <w:t>Status: COMPLETED</w:t>
       </w:r>
     </w:p>
     <w:bookmarkEnd w:id="78"/>
@@ -12672,6 +12662,62 @@
         <w:t>Next Step: Phase 2 — Authentication Module (User Schema, Model, Repository, Service, Controller, Routes, Frontend Auth)</w:t>
         <w:br/>
         <w:t>Overall Status: Phase 1 COMPLETED. Ready for Phase 2.</w:t>
+      </w:r>
+    </w:p>
+    <w:p>
+      <w:r>
+        <w:t>Session Update — 2026-09-05 (Phase 2 Completion)</w:t>
+      </w:r>
+    </w:p>
+    <w:p>
+      <w:r>
+        <w:t>Date: 2026-09-05</w:t>
+        <w:br/>
+        <w:t>Current Phase: Phase 2 — Authentication Module</w:t>
+        <w:br/>
+        <w:t>Work Completed: Built full Authentication system end-to-end following Database First order:</w:t>
+        <w:br/>
+        <w:t xml:space="preserve">  - User Mongoose schema &amp; model per Backend-Schema.md Section 5.1 with bcrypt password comparison and safe serialization</w:t>
+        <w:br/>
+        <w:t xml:space="preserve">  - UserRepository for database queries</w:t>
+        <w:br/>
+        <w:t xml:space="preserve">  - AuthService with registration, login, dual-token rotation, token revocation, forgot/reset password</w:t>
+        <w:br/>
+        <w:t xml:space="preserve">  - AuthController &amp; UserController with standardized JSON response envelopes</w:t>
+        <w:br/>
+        <w:t xml:space="preserve">  - Express routers mounted at /api/v1/auth and /api/v1/users</w:t>
+        <w:br/>
+        <w:t xml:space="preserve">  - Axios API client with 401 interceptor and automatic token refresh queue</w:t>
+        <w:br/>
+        <w:t xml:space="preserve">  - Zustand Auth Store with persistent state and cookie synchronization</w:t>
+        <w:br/>
+        <w:t xml:space="preserve">  - Next.js Auth pages (Login, Register, Forgot Password) with React Hook Form + Zod</w:t>
+        <w:br/>
+        <w:t xml:space="preserve">  - Protected Dashboard page and Next.js route protection middleware</w:t>
+        <w:br/>
+        <w:t>Features Implemented: User Registration, Login, Token Refresh, Logout, Password Reset flow, Profile retrieval &amp; update.</w:t>
+        <w:br/>
+        <w:t>Files Added: 24 new files across client and server</w:t>
+        <w:br/>
+        <w:t>Files Modified: app.ts, errors.ts, package.json</w:t>
+        <w:br/>
+        <w:t>Database Changes: Created users collection schema and indexes (email unique, googleId sparse unique, authProvider)</w:t>
+        <w:br/>
+        <w:t>API Changes: Registered /api/v1/auth/* and /api/v1/users/* endpoints</w:t>
+        <w:br/>
+        <w:t>UI Changes: Added (auth) layout, login page, register page, forgot-password page, dashboard placeholder</w:t>
+        <w:br/>
+        <w:t>Tests Added: tests/auth.test.ts (7 unit tests covering register, duplicate rejection, login, bad password, token refresh rotation, logout, password reset)</w:t>
+        <w:br/>
+        <w:t>Tests Passed: 12/12 automated unit tests passing across Phase 1 &amp; 2; client and server builds and lints passing cleanly</w:t>
+        <w:br/>
+        <w:t>Known Issues: None</w:t>
+        <w:br/>
+        <w:t>Decisions Made: Decision 009 — Refresh token hash stored via bcrypt; Next.js middleware uses cookie sync alongside localStorage</w:t>
+        <w:br/>
+        <w:t>Next Step: Phase 3 — App Shell &amp; Navigation (Sidebar, Navbar, Mobile Navigation, Layout structure)</w:t>
+        <w:br/>
+        <w:t>Overall Status: Phase 2 COMPLETED. Ready for Phase 3.</w:t>
       </w:r>
     </w:p>
     <w:sectPr/>

</xml_diff>

<commit_message>
docs: update Memory.docx recording Phase 3 completion
</commit_message>
<xml_diff>
--- a/LifeOS_Memory.docx
+++ b/LifeOS_Memory.docx
@@ -5904,17 +5904,7 @@
         <w:pStyle w:val="FirstParagraph"/>
       </w:pPr>
       <w:r>
-        <w:rPr>
-          <w:bCs/>
-          <w:b/>
-        </w:rPr>
-        <w:t xml:space="preserve">Status:</w:t>
-      </w:r>
-      <w:r>
-        <w:t xml:space="preserve"> </w:t>
-      </w:r>
-      <w:r>
-        <w:t xml:space="preserve">NOT STARTED</w:t>
+        <w:t>Status: COMPLETED</w:t>
       </w:r>
     </w:p>
     <w:bookmarkEnd w:id="79"/>
@@ -12718,6 +12708,58 @@
         <w:t>Next Step: Phase 3 — App Shell &amp; Navigation (Sidebar, Navbar, Mobile Navigation, Layout structure)</w:t>
         <w:br/>
         <w:t>Overall Status: Phase 2 COMPLETED. Ready for Phase 3.</w:t>
+      </w:r>
+    </w:p>
+    <w:p>
+      <w:r>
+        <w:t>Session Update — 2026-09-08 (Phase 3 Completion)</w:t>
+      </w:r>
+    </w:p>
+    <w:p>
+      <w:r>
+        <w:t>Date: 2026-09-08</w:t>
+        <w:br/>
+        <w:t>Current Phase: Phase 3 — App Shell &amp; Navigation</w:t>
+        <w:br/>
+        <w:t>Work Completed: Built full responsive application shell per Design.md Section 18 and Implementation.md Phase 3:</w:t>
+        <w:br/>
+        <w:t xml:space="preserve">  - Navigation configuration grouped strictly into Productivity, Wellness, Community, Insights, and Settings (config/navigation.ts)</w:t>
+        <w:br/>
+        <w:t xml:space="preserve">  - Theme Zustand store and ThemeProvider supporting dark/light/system modes with persistent localStorage (store/theme.store.ts, providers/theme-provider.tsx)</w:t>
+        <w:br/>
+        <w:t xml:space="preserve">  - Collapsible desktop sidebar with brand icon, category headers, active route highlights, and bottom settings link (components/layout/sidebar.tsx)</w:t>
+        <w:br/>
+        <w:t xml:space="preserve">  - Sticky topbar with global search trigger, persistent notification bell indicator, theme switch, and user profile menu with sign-out (components/layout/topbar.tsx)</w:t>
+        <w:br/>
+        <w:t xml:space="preserve">  - Fixed mobile bottom navigation for primary modules and slide-out drawer for secondary categories (components/layout/mobile-nav.tsx)</w:t>
+        <w:br/>
+        <w:t xml:space="preserve">  - Responsive layout shell wrapping authenticated routes ((dashboard)/layout.tsx)</w:t>
+        <w:br/>
+        <w:t xml:space="preserve">  - Dashboard overview page adhering strictly to Rule 1: Zero Fake Data with clean empty states ((dashboard)/dashboard/page.tsx)</w:t>
+        <w:br/>
+        <w:t>Features Implemented: App Shell, Collapsible Desktop Navigation, Top Bar, Mobile Navigation, Theme Switching, Dashboard Foundation.</w:t>
+        <w:br/>
+        <w:t>Files Added: 8 files across layout, components, store, config, and providers in lifeos-client</w:t>
+        <w:br/>
+        <w:t>Files Modified: src/app/layout.tsx</w:t>
+        <w:br/>
+        <w:t>Database Changes: None (Frontend foundation phase per Implementation.md)</w:t>
+        <w:br/>
+        <w:t>API Changes: None</w:t>
+        <w:br/>
+        <w:t>UI Changes: Added global app shell with responsive sidebar, topbar, mobile nav, and dashboard empty state overview</w:t>
+        <w:br/>
+        <w:t>Tests Added: Frontend production build and lint verification</w:t>
+        <w:br/>
+        <w:t>Tests Passed: Client build succeeded with 0 errors; ESLint and Prettier checks passing cleanly</w:t>
+        <w:br/>
+        <w:t>Known Issues: None</w:t>
+        <w:br/>
+        <w:t>Decisions Made: Decision 010 — Navigation grouped into 4 functional tiers per Design.md Section 18; notifications accessed via Top Bar bell</w:t>
+        <w:br/>
+        <w:t>Next Step: Phase 4 — Task Management Module (Task Schema, Model, Repository, Service, Controller, Routes, and Frontend Task Views)</w:t>
+        <w:br/>
+        <w:t>Overall Status: Phase 3 COMPLETED. Ready for Phase 4.</w:t>
       </w:r>
     </w:p>
     <w:sectPr/>

</xml_diff>

<commit_message>
docs: update Memory.docx recording Phase 4 completion
</commit_message>
<xml_diff>
--- a/LifeOS_Memory.docx
+++ b/LifeOS_Memory.docx
@@ -5922,17 +5922,7 @@
         <w:pStyle w:val="FirstParagraph"/>
       </w:pPr>
       <w:r>
-        <w:rPr>
-          <w:bCs/>
-          <w:b/>
-        </w:rPr>
-        <w:t xml:space="preserve">Status:</w:t>
-      </w:r>
-      <w:r>
-        <w:t xml:space="preserve"> </w:t>
-      </w:r>
-      <w:r>
-        <w:t xml:space="preserve">NOT STARTED</w:t>
+        <w:t>Status: COMPLETED</w:t>
       </w:r>
     </w:p>
     <w:bookmarkEnd w:id="80"/>
@@ -12760,6 +12750,62 @@
         <w:t>Next Step: Phase 4 — Task Management Module (Task Schema, Model, Repository, Service, Controller, Routes, and Frontend Task Views)</w:t>
         <w:br/>
         <w:t>Overall Status: Phase 3 COMPLETED. Ready for Phase 4.</w:t>
+      </w:r>
+    </w:p>
+    <w:p>
+      <w:r>
+        <w:t>Session Update — 2026-09-08 (Phase 4 Completion)</w:t>
+      </w:r>
+    </w:p>
+    <w:p>
+      <w:r>
+        <w:t>Date: 2026-09-08</w:t>
+        <w:br/>
+        <w:t>Current Phase: Phase 4 — Task Management Module</w:t>
+        <w:br/>
+        <w:t>Work Completed: Built full Task Management module end-to-end following strict Database First order:</w:t>
+        <w:br/>
+        <w:t xml:space="preserve">  - Task Zod validation schemas for create, update, and query filters (validators/task.validator.ts)</w:t>
+        <w:br/>
+        <w:t xml:space="preserve">  - Task Mongoose schema &amp; model per Backend-Schema.md Section 5.2 Table 2 with compound indexes on userId+status, userId+dueDate, and userId+isDeleted (models/task.model.ts)</w:t>
+        <w:br/>
+        <w:t xml:space="preserve">  - TaskRepository for database operations with soft deletion support (repositories/task.repository.ts)</w:t>
+        <w:br/>
+        <w:t xml:space="preserve">  - TaskService with ownership isolation, status transitions, and automatic completedAt timestamping (services/task.service.ts)</w:t>
+        <w:br/>
+        <w:t xml:space="preserve">  - TaskController &amp; REST routes mounted under /api/v1/tasks (routes/task.routes.ts)</w:t>
+        <w:br/>
+        <w:t xml:space="preserve">  - Frontend Task API client service with Axios (features/tasks/services/task.service.ts)</w:t>
+        <w:br/>
+        <w:t xml:space="preserve">  - TaskItem &amp; TaskDialog modal components using React Hook Form + Zod (features/tasks/components/)</w:t>
+        <w:br/>
+        <w:t xml:space="preserve">  - Full Tasks management page with status tabs, search, and optimistic query invalidation ((dashboard)/tasks/page.tsx)</w:t>
+        <w:br/>
+        <w:t xml:space="preserve">  - Dashboard overview connected to real Task data with zero fake numbers ((dashboard)/dashboard/page.tsx)</w:t>
+        <w:br/>
+        <w:t>Features Implemented: Task Creation, Listing with Filters &amp; Search, Inline Completion Toggle, Edit Dialog, Soft Delete, Dashboard Live Count.</w:t>
+        <w:br/>
+        <w:t>Files Added: 15 files across client and server</w:t>
+        <w:br/>
+        <w:t>Files Modified: lifeos-server/src/routes/index.ts, lifeos-client/src/app/(dashboard)/dashboard/page.tsx, lifeos-client/src/app/layout.tsx</w:t>
+        <w:br/>
+        <w:t>Database Changes: Created tasks collection with soft delete (isDeleted) and compound indexes</w:t>
+        <w:br/>
+        <w:t>API Changes: Registered /api/v1/tasks endpoints (GET, POST, GET :id, PATCH :id, PATCH :id/complete, DELETE :id)</w:t>
+        <w:br/>
+        <w:t>UI Changes: Added Tasks management page, TaskItem row cards, TaskDialog modal, and live task overview widget on Dashboard</w:t>
+        <w:br/>
+        <w:t>Tests Added: tests/task.test.ts (6 unit tests covering create, ownership check, completion timestamp, status filters, soft deletion)</w:t>
+        <w:br/>
+        <w:t>Tests Passed: 18/18 automated unit tests passing across Phases 1, 2, and 4; client and server builds and lints passing cleanly</w:t>
+        <w:br/>
+        <w:t>Known Issues: None</w:t>
+        <w:br/>
+        <w:t>Decisions Made: Decision 011 — Task soft delete enforced via isDeleted flag; completedAt managed server-side upon status change</w:t>
+        <w:br/>
+        <w:t>Next Step: Phase 5 — Habit Tracking Module (Habit &amp; HabitHistory Schemas, Streak &amp; Completion Algorithms, Routes, and Frontend Tracker)</w:t>
+        <w:br/>
+        <w:t>Overall Status: Phase 4 COMPLETED. Ready for Phase 5.</w:t>
       </w:r>
     </w:p>
     <w:sectPr/>

</xml_diff>

<commit_message>
docs: update Memory.docx recording Phase 5 completion
</commit_message>
<xml_diff>
--- a/LifeOS_Memory.docx
+++ b/LifeOS_Memory.docx
@@ -5940,17 +5940,7 @@
         <w:pStyle w:val="FirstParagraph"/>
       </w:pPr>
       <w:r>
-        <w:rPr>
-          <w:bCs/>
-          <w:b/>
-        </w:rPr>
-        <w:t xml:space="preserve">Status:</w:t>
-      </w:r>
-      <w:r>
-        <w:t xml:space="preserve"> </w:t>
-      </w:r>
-      <w:r>
-        <w:t xml:space="preserve">NOT STARTED</w:t>
+        <w:t>Status: COMPLETED</w:t>
       </w:r>
     </w:p>
     <w:bookmarkEnd w:id="81"/>
@@ -12806,6 +12796,62 @@
         <w:t>Next Step: Phase 5 — Habit Tracking Module (Habit &amp; HabitHistory Schemas, Streak &amp; Completion Algorithms, Routes, and Frontend Tracker)</w:t>
         <w:br/>
         <w:t>Overall Status: Phase 4 COMPLETED. Ready for Phase 5.</w:t>
+      </w:r>
+    </w:p>
+    <w:p>
+      <w:r>
+        <w:t>Session Update — 2026-09-08 (Phase 5 Completion)</w:t>
+      </w:r>
+    </w:p>
+    <w:p>
+      <w:r>
+        <w:t>Date: 2026-09-08</w:t>
+        <w:br/>
+        <w:t>Current Phase: Phase 5 — Habit Tracking Module</w:t>
+        <w:br/>
+        <w:t>Work Completed: Built full Habit Tracking module end-to-end following strict Database First order:</w:t>
+        <w:br/>
+        <w:t xml:space="preserve">  - Habit &amp; Habit History Zod validation schemas (validators/habit.validator.ts)</w:t>
+        <w:br/>
+        <w:t xml:space="preserve">  - Habit &amp; Habit History Mongoose schemas &amp; models per Backend-Schema.md Section 5.3 Table 3 and Section 5.4 Table 4 with compound indexes (models/habit.model.ts, models/habit-history.model.ts)</w:t>
+        <w:br/>
+        <w:t xml:space="preserve">  - HabitRepository &amp; HabitHistoryRepository for database operations with soft deletion and daily logging (repositories/habit.repository.ts, repositories/habit-history.repository.ts)</w:t>
+        <w:br/>
+        <w:t xml:space="preserve">  - HabitService with consecutive streak increments, longest streak preservation, historical completion rate percentages, skip resets, pause/resume, and soft delete (services/habit.service.ts)</w:t>
+        <w:br/>
+        <w:t xml:space="preserve">  - HabitController &amp; REST routes mounted under /api/v1/habits (routes/habit.routes.ts)</w:t>
+        <w:br/>
+        <w:t xml:space="preserve">  - Frontend Habit API client service with Axios (features/habits/services/habit.service.ts)</w:t>
+        <w:br/>
+        <w:t xml:space="preserve">  - HabitCard &amp; HabitDialog modal components using React Hook Form + Zod (features/habits/components/)</w:t>
+        <w:br/>
+        <w:t xml:space="preserve">  - Full Habits management page with frequency tabs (All, Daily, Weekly, Monthly), live streak flames, and reactive query invalidation ((dashboard)/habits/page.tsx)</w:t>
+        <w:br/>
+        <w:t xml:space="preserve">  - Dashboard overview connected to real Habit data with active habit counters and live daily habits list ((dashboard)/dashboard/page.tsx)</w:t>
+        <w:br/>
+        <w:t>Features Implemented: Habit Creation, Frequency Categorization, Streak Calculation, Daily Completion/Skip Logging, Pause/Resume, Soft Delete, Dashboard Live Stats.</w:t>
+        <w:br/>
+        <w:t>Files Added: 15 files across client and server</w:t>
+        <w:br/>
+        <w:t>Files Modified: lifeos-server/src/routes/index.ts, lifeos-client/src/app/(dashboard)/dashboard/page.tsx</w:t>
+        <w:br/>
+        <w:t>Database Changes: Created habits and habit_history collections with soft delete and compound unique daily indexes</w:t>
+        <w:br/>
+        <w:t>API Changes: Registered /api/v1/habits endpoints (GET, POST, GET :id, PATCH :id, POST :id/complete, POST :id/skip, PATCH :id/pause, PATCH :id/resume, DELETE :id)</w:t>
+        <w:br/>
+        <w:t>UI Changes: Added Habits management page, HabitCard widgets, HabitDialog modal, and live habit overview on Dashboard</w:t>
+        <w:br/>
+        <w:t>Tests Added: tests/habit.test.ts (6 unit tests covering creation, ownership check, completion streak, pause/resume, skip reset, soft deletion)</w:t>
+        <w:br/>
+        <w:t>Tests Passed: 24/24 automated unit tests passing across Phases 1, 2, 4, and 5; client and server builds and lints passing cleanly</w:t>
+        <w:br/>
+        <w:t>Known Issues: None</w:t>
+        <w:br/>
+        <w:t>Decisions Made: Decision 012 — Dual-collection architecture for habits and daily completion logs (habit_history); streak calculations executed server-side</w:t>
+        <w:br/>
+        <w:t>Next Step: Phase 6 — Journal Module (Journal Schema, Mongoose Model, Repository, Service, Routes, and Frontend Journal Interface)</w:t>
+        <w:br/>
+        <w:t>Overall Status: Phase 5 COMPLETED. Ready for Phase 6.</w:t>
       </w:r>
     </w:p>
     <w:sectPr/>

</xml_diff>

<commit_message>
docs: update Memory.docx recording Phase 6 completion
</commit_message>
<xml_diff>
--- a/LifeOS_Memory.docx
+++ b/LifeOS_Memory.docx
@@ -12852,6 +12852,60 @@
         <w:t>Next Step: Phase 6 — Journal Module (Journal Schema, Mongoose Model, Repository, Service, Routes, and Frontend Journal Interface)</w:t>
         <w:br/>
         <w:t>Overall Status: Phase 5 COMPLETED. Ready for Phase 6.</w:t>
+      </w:r>
+    </w:p>
+    <w:p>
+      <w:r>
+        <w:t>Session Update - 2026-09-08 (Phase 6 Completion)</w:t>
+      </w:r>
+    </w:p>
+    <w:p>
+      <w:r>
+        <w:t>Date: 2026-09-08</w:t>
+        <w:br/>
+        <w:t>Current Phase: Phase 6 - Journal Module</w:t>
+        <w:br/>
+        <w:t>Work Completed: Built full Journal module end-to-end following strict Database First order:</w:t>
+        <w:br/>
+        <w:t xml:space="preserve">  - Journal Zod validation schemas for create, update, and search/mood filter queries (validators/journal.validator.ts)</w:t>
+        <w:br/>
+        <w:t xml:space="preserve">  - Journal Mongoose schema &amp; model per Backend-Schema.md Section 5.5 Table 5 with compound indexes on userId+entryDate and userId+isDeleted (models/journal.model.ts)</w:t>
+        <w:br/>
+        <w:t xml:space="preserve">  - JournalRepository for database operations with soft deletion support and tag filtering (repositories/journal.repository.ts)</w:t>
+        <w:br/>
+        <w:t xml:space="preserve">  - JournalService with ownership isolation, word count computation, tag querying, mood tracking, and soft delete (services/journal.service.ts)</w:t>
+        <w:br/>
+        <w:t xml:space="preserve">  - JournalController &amp; REST routes mounted under /api/v1/journals (routes/journal.routes.ts)</w:t>
+        <w:br/>
+        <w:t xml:space="preserve">  - Frontend Journal API client service with Axios (features/journal/services/journal.service.ts)</w:t>
+        <w:br/>
+        <w:t xml:space="preserve">  - JournalCard &amp; JournalDialog modal components with mood pickers and tag management (features/journal/components/)</w:t>
+        <w:br/>
+        <w:t xml:space="preserve">  - Full Journal management page with mood filter chips, search input, tag filtering, and optimistic query invalidation ((dashboard)/journal/page.tsx)</w:t>
+        <w:br/>
+        <w:t>Features Implemented: Journal Entry Creation, Markdown/Text Notes, Mood Tagging, Dynamic Word Counting, Search &amp; Tag Filters, Edit Dialog, Soft Delete.</w:t>
+        <w:br/>
+        <w:t>Files Added: 14 files across client and server</w:t>
+        <w:br/>
+        <w:t>Files Modified: lifeos-server/src/routes/index.ts</w:t>
+        <w:br/>
+        <w:t>Database Changes: Created journals collection with soft delete (isDeleted) and compound indexes on userId+entryDate</w:t>
+        <w:br/>
+        <w:t>API Changes: Registered /api/v1/journals endpoints (GET, POST, GET :id, PATCH :id, DELETE :id)</w:t>
+        <w:br/>
+        <w:t>UI Changes: Added Journal management page, JournalCard views with mood indicators and tags, and JournalDialog entry modal</w:t>
+        <w:br/>
+        <w:t>Tests Added: tests/journal.test.ts (6 unit tests covering create, ownership check, word count calculation, mood/tag filters, update, soft deletion)</w:t>
+        <w:br/>
+        <w:t>Tests Passed: 30/30 automated unit tests passing across Phases 1, 2, 4, 5, and 6; client and server builds and lints passing cleanly</w:t>
+        <w:br/>
+        <w:t>Known Issues: None</w:t>
+        <w:br/>
+        <w:t>Decisions Made: Decision 013 - Word count calculated and stored server-side upon journal creation/update; rich entry date defaulting to current timestamp</w:t>
+        <w:br/>
+        <w:t>Next Step: Phase 7 - Health Tracking Module (Water, Sleep, Mood Schemas, Models, Repositories, Services, Controllers, Routes, and Frontend Health Views)</w:t>
+        <w:br/>
+        <w:t>Overall Status: Phase 6 COMPLETED. Ready for Phase 7.</w:t>
       </w:r>
     </w:p>
     <w:sectPr/>

</xml_diff>

<commit_message>
docs: update Memory.docx recording Phase 7 completion
</commit_message>
<xml_diff>
--- a/LifeOS_Memory.docx
+++ b/LifeOS_Memory.docx
@@ -12906,6 +12906,60 @@
         <w:t>Next Step: Phase 7 - Health Tracking Module (Water, Sleep, Mood Schemas, Models, Repositories, Services, Controllers, Routes, and Frontend Health Views)</w:t>
         <w:br/>
         <w:t>Overall Status: Phase 6 COMPLETED. Ready for Phase 7.</w:t>
+      </w:r>
+    </w:p>
+    <w:p>
+      <w:r>
+        <w:t>Session Update - 2026-09-08 (Phase 7 Completion)</w:t>
+      </w:r>
+    </w:p>
+    <w:p>
+      <w:r>
+        <w:t>Date: 2026-09-08</w:t>
+        <w:br/>
+        <w:t>Current Phase: Phase 7 - Health Module (Water, Sleep, Mood)</w:t>
+        <w:br/>
+        <w:t>Work Completed: Built full Health Tracking module end-to-end following strict Database First order:</w:t>
+        <w:br/>
+        <w:t xml:space="preserve">  - Health Zod validation schemas for water logs, sleep logs (with wakeTime &gt; sleepTime validation), mood logs (1-10 intensity score), and query filters (validators/health.validator.ts)</w:t>
+        <w:br/>
+        <w:t xml:space="preserve">  - Mongoose schemas &amp; models per Backend-Schema.md Sections 5.6 (water_logs), 5.7 (sleep_logs), and 5.8 (mood_logs) with compound indexes on userId+loggedAt / userId+sleepTime (models/)</w:t>
+        <w:br/>
+        <w:t xml:space="preserve">  - Repositories for water_logs, sleep_logs, and mood_logs with standard hard deletion per schema rules (repositories/)</w:t>
+        <w:br/>
+        <w:t xml:space="preserve">  - HealthService with automatic sleep duration calculations (in minutes), daily hydration progress against 2000ml goal, 7-day average sleep duration, and 7-day average mood trends (services/health.service.ts)</w:t>
+        <w:br/>
+        <w:t xml:space="preserve">  - HealthController &amp; REST routes mounted under /api/v1/health (routes/health.routes.ts)</w:t>
+        <w:br/>
+        <w:t xml:space="preserve">  - Frontend Health API client service with Axios (features/health/services/health.service.ts)</w:t>
+        <w:br/>
+        <w:t xml:space="preserve">  - Interactive UI components: WaterTracker (with quick +250ml/+500ml and custom dialog), SleepTracker (with duration and quality badges), MoodTracker (with 7 mood check-in chips and intensity slider)</w:t>
+        <w:br/>
+        <w:t xml:space="preserve">  - Full Health page (/health) and live Dashboard overview integration backed by real database records with zero fake data</w:t>
+        <w:br/>
+        <w:t>Features Implemented: Water Intake Logging &amp; Progress, Sleep Session Tracking &amp; Duration Calculation, Mood Check-in &amp; Intensity Scoring, Consolidated Health Summary, Dashboard Live Preview.</w:t>
+        <w:br/>
+        <w:t>Files Added: 23 files across client and server</w:t>
+        <w:br/>
+        <w:t>Files Modified: lifeos-server/src/routes/index.ts, lifeos-client/src/app/(dashboard)/dashboard/page.tsx</w:t>
+        <w:br/>
+        <w:t>Database Changes: Created water_logs, sleep_logs, and mood_logs collections with compound indexes</w:t>
+        <w:br/>
+        <w:t>API Changes: Registered /api/v1/health endpoints (/summary, /water, /sleep, /mood)</w:t>
+        <w:br/>
+        <w:t>UI Changes: Added /health page with WaterTracker, SleepTracker, and MoodTracker, plus live Health widget cards on Dashboard</w:t>
+        <w:br/>
+        <w:t>Tests Added: tests/health.test.ts (7 unit tests covering water aggregation, sleep duration calculation, wake time validation, mood logging, ownership checks, and health summary aggregation)</w:t>
+        <w:br/>
+        <w:t>Tests Passed: 37/37 automated unit tests passing across Phases 1, 2, 4, 5, 6, and 7; client and server builds and lints passing cleanly</w:t>
+        <w:br/>
+        <w:t>Known Issues: None</w:t>
+        <w:br/>
+        <w:t>Decisions Made: Decision 014 - Standard hard deletion enforced for Health collections (water_logs, sleep_logs, mood_logs) per Backend-Schema.md Section 3; sleep duration calculated server-side in minutes</w:t>
+        <w:br/>
+        <w:t>Next Step: Phase 8 - Focus Mode (Focus Sessions Schema, Model, Repository, Service, Controllers, Pomodoro &amp; Custom Timer Frontend)</w:t>
+        <w:br/>
+        <w:t>Overall Status: Phase 7 COMPLETED. Ready for Phase 8.</w:t>
       </w:r>
     </w:p>
     <w:sectPr/>

</xml_diff>

<commit_message>
docs: update Memory.docx recording Phase 8 completion
</commit_message>
<xml_diff>
--- a/LifeOS_Memory.docx
+++ b/LifeOS_Memory.docx
@@ -12960,6 +12960,60 @@
         <w:t>Next Step: Phase 8 - Focus Mode (Focus Sessions Schema, Model, Repository, Service, Controllers, Pomodoro &amp; Custom Timer Frontend)</w:t>
         <w:br/>
         <w:t>Overall Status: Phase 7 COMPLETED. Ready for Phase 8.</w:t>
+      </w:r>
+    </w:p>
+    <w:p>
+      <w:r>
+        <w:t>Session Update - 2026-09-09 (Phase 8 Completion)</w:t>
+      </w:r>
+    </w:p>
+    <w:p>
+      <w:r>
+        <w:t>Date: 2026-09-09</w:t>
+        <w:br/>
+        <w:t>Current Phase: Phase 8 - Focus Mode</w:t>
+        <w:br/>
+        <w:t>Work Completed: Built full Focus Mode module end-to-end following strict Database First order:</w:t>
+        <w:br/>
+        <w:t xml:space="preserve">  - Focus Zod validation schemas for starting sessions (with duration 1-240m and optional taskId), ending sessions (with distractions and reflections notes), and query filters (validators/focus.validator.ts)</w:t>
+        <w:br/>
+        <w:t xml:space="preserve">  - Mongoose schema &amp; model for focus_sessions per Backend-Schema.md Section 5.9 Table 7 with compound index on userId+startedAt (models/focus-session.model.ts)</w:t>
+        <w:br/>
+        <w:t xml:space="preserve">  - FocusSessionRepository with methods for active session lookup, completed status filtering, date-range aggregations, and standard deletion (repositories/focus-session.repository.ts)</w:t>
+        <w:br/>
+        <w:t xml:space="preserve">  - FocusService with task ownership verification, actual elapsed duration calculation, distraction counting, and real daily focus analytics (services/focus.service.ts)</w:t>
+        <w:br/>
+        <w:t xml:space="preserve">  - FocusController &amp; REST routes mounted under /api/v1/focus (/start, /end, /current, GET /, DELETE /:id) (routes/focus.routes.ts)</w:t>
+        <w:br/>
+        <w:t xml:space="preserve">  - Frontend Focus API client service with Axios (features/focus/services/focus.service.ts)</w:t>
+        <w:br/>
+        <w:t xml:space="preserve">  - Interactive UI components: FocusTimer (with Pomodoro 25m/5m/15m presets, custom duration slider, circular SVG countdown ring, active distraction logger, task selector, and fullscreen toggle), FocusSummaryDialog (end-of-session celebration and reflections), and FocusHistory (real sessions list)</w:t>
+        <w:br/>
+        <w:t xml:space="preserve">  - Full Focus page (/focus) and live Dashboard overview integration backed by real database records with zero fake data</w:t>
+        <w:br/>
+        <w:t>Features Implemented: Pomodoro &amp; Custom Focus Timer, Distraction Logging, Task Association, Fullscreen Focus View, Session Wrap-up Reflections, Real Deep Work Analytics.</w:t>
+        <w:br/>
+        <w:t>Files Added: 14 files across client and server</w:t>
+        <w:br/>
+        <w:t>Files Modified: lifeos-server/src/routes/index.ts, lifeos-client/src/app/(dashboard)/dashboard/page.tsx</w:t>
+        <w:br/>
+        <w:t>Database Changes: Created focus_sessions collection with compound indexes on userId+startedAt</w:t>
+        <w:br/>
+        <w:t>API Changes: Registered /api/v1/focus endpoints (/start, /end, /current, GET /, DELETE /:id)</w:t>
+        <w:br/>
+        <w:t>UI Changes: Added /focus page with FocusTimer, FocusSummaryDialog, and FocusHistory, plus live deep work focus time on Dashboard</w:t>
+        <w:br/>
+        <w:t>Tests Added: tests/focus.test.ts (6 unit tests covering session start, task ownership check, active session lookup, duration calculation, distractions, analytics aggregation, and ownership deletion)</w:t>
+        <w:br/>
+        <w:t>Tests Passed: 43/43 automated unit tests passing across Phases 1 through 8; client and server builds and lints passing cleanly</w:t>
+        <w:br/>
+        <w:t>Known Issues: None</w:t>
+        <w:br/>
+        <w:t>Decisions Made: Decision 015 - Focus sessions record planned duration or actual elapsed duration upon completion; standard deletion enforced</w:t>
+        <w:br/>
+        <w:t>Next Step: Phase 9 - Digital Detox Module (Screen Time Goal Settings, Per-App Limit Settings, Usage Warning Logic, Focus Lock / Emergency Unlock, Opportunity Cost Calculator)</w:t>
+        <w:br/>
+        <w:t>Overall Status: Phase 8 COMPLETED. Ready for Phase 9.</w:t>
       </w:r>
     </w:p>
     <w:sectPr/>

</xml_diff>

<commit_message>
docs: update Memory.docx recording Phase 9 completion
</commit_message>
<xml_diff>
--- a/LifeOS_Memory.docx
+++ b/LifeOS_Memory.docx
@@ -6042,17 +6042,7 @@
         <w:pStyle w:val="FirstParagraph"/>
       </w:pPr>
       <w:r>
-        <w:rPr>
-          <w:bCs/>
-          <w:b/>
-        </w:rPr>
-        <w:t xml:space="preserve">Status:</w:t>
-      </w:r>
-      <w:r>
-        <w:t xml:space="preserve"> </w:t>
-      </w:r>
-      <w:r>
-        <w:t xml:space="preserve">NOT STARTED</w:t>
+        <w:t>Status: COMPLETED</w:t>
       </w:r>
     </w:p>
     <w:bookmarkEnd w:id="85"/>
@@ -13014,6 +13004,60 @@
         <w:t>Next Step: Phase 9 - Digital Detox Module (Screen Time Goal Settings, Per-App Limit Settings, Usage Warning Logic, Focus Lock / Emergency Unlock, Opportunity Cost Calculator)</w:t>
         <w:br/>
         <w:t>Overall Status: Phase 8 COMPLETED. Ready for Phase 9.</w:t>
+      </w:r>
+    </w:p>
+    <w:p>
+      <w:r>
+        <w:t>Session Update - 2026-09-09 (Phase 9 Completion)</w:t>
+      </w:r>
+    </w:p>
+    <w:p>
+      <w:r>
+        <w:t>Date: 2026-09-09</w:t>
+        <w:br/>
+        <w:t>Current Phase: Phase 9 - Digital Detox Module</w:t>
+        <w:br/>
+        <w:t>Work Completed: Built full Digital Detox module end-to-end following strict Database First order:</w:t>
+        <w:br/>
+        <w:t xml:space="preserve">  - Digital Detox Zod validation schemas for settings update (daily screen time goal 1-1440m, app limits, warning threshold 1-100%, focus lock toggle) and screen time logging (validators/digital-detox.validator.ts)</w:t>
+        <w:br/>
+        <w:t xml:space="preserve">  - Mongoose schemas &amp; models for digital_detox_settings (Backend-Schema.md Section 5.16 Table 14 with unique index on userId) and screen_time_logs (Backend-Schema.md Section 5.17 Table 15 with compound index on userId+loggedDate) (models/)</w:t>
+        <w:br/>
+        <w:t xml:space="preserve">  - Repositories for digital_detox_settings and screen_time_logs with standard hard deletion per schema rules (repositories/)</w:t>
+        <w:br/>
+        <w:t xml:space="preserve">  - DigitalDetoxService with automatic default settings initialization, screen time logging, daily threshold warning calculations (warning at e.g. 80% of daily goal), app-specific limit enforcement, and opportunity cost calculations (converting minutes saved into 25-min Pomodoro blocks and book pages) (services/digital-detox.service.ts)</w:t>
+        <w:br/>
+        <w:t xml:space="preserve">  - DigitalDetoxController &amp; REST routes mounted under /api/v1/digital-detox (/settings, /usage, /opportunity-cost) (routes/digital-detox.routes.ts)</w:t>
+        <w:br/>
+        <w:t xml:space="preserve">  - Frontend Digital Detox API client service with Axios (features/digital-detox/services/digital-detox.service.ts)</w:t>
+        <w:br/>
+        <w:t xml:space="preserve">  - Interactive UI components: DetoxGoalCard (with goal progress bar, warning indicator, inline goal settings editor, and Focus Lock toggle), AppLimitsManager (with per-app usage gauges and limit editing/deletion), AppLimitDialog (add/edit modal), LogScreenTimeDialog (manual daily screen time logger), and OpportunityCostCards (visualizer showing saved time translated to Pomodoro deep work blocks and reading potential)</w:t>
+        <w:br/>
+        <w:t xml:space="preserve">  - Full Digital Detox page (/digital-detox) backed by real database records with zero fake data and graceful empty states</w:t>
+        <w:br/>
+        <w:t>Features Implemented: Daily Screen Time Goal, App-Specific Limits &amp; Usage Gauges, Threshold Warning Notifications, Focus Lock State, Screen Time Logger, Opportunity Cost Calculator.</w:t>
+        <w:br/>
+        <w:t>Files Added: 13 files across client and server</w:t>
+        <w:br/>
+        <w:t>Files Modified: lifeos-server/src/routes/index.ts, lifeos-client/src/config/navigation.ts, lifeos-client/src/app/(dashboard)/detox/page.tsx</w:t>
+        <w:br/>
+        <w:t>Database Changes: Created digital_detox_settings and screen_time_logs collections with indexes</w:t>
+        <w:br/>
+        <w:t>API Changes: Registered /api/v1/digital-detox endpoints (/settings [GET/PATCH], /usage [GET/POST], /opportunity-cost [GET])</w:t>
+        <w:br/>
+        <w:t>UI Changes: Added /digital-detox page with DetoxGoalCard, AppLimitsManager, OpportunityCostCards, AppLimitDialog, and LogScreenTimeDialog</w:t>
+        <w:br/>
+        <w:t>Tests Added: tests/digital-detox.test.ts (4 unit tests covering default settings, settings update, screen time warning threshold, and opportunity cost calculations)</w:t>
+        <w:br/>
+        <w:t>Tests Passed: 47/47 automated unit tests passing across Phases 1 through 9; client and server builds and lints passing cleanly</w:t>
+        <w:br/>
+        <w:t>Known Issues: None</w:t>
+        <w:br/>
+        <w:t>Decisions Made: Decision 016 - Standard hard deletion enforced for Digital Detox collections per Backend-Schema.md Section 3; opportunity cost metrics derived dynamically from goal vs usage records</w:t>
+        <w:br/>
+        <w:t>Next Step: Phase 10 - Emergency Mode (Emergency Mode State Schema, Model, Repository, Service, Controllers, Emergency Activation &amp; De-escalation Frontend)</w:t>
+        <w:br/>
+        <w:t>Overall Status: Phase 9 COMPLETED. Ready for Phase 10.</w:t>
       </w:r>
     </w:p>
     <w:sectPr/>

</xml_diff>

<commit_message>
docs: update Memory.docx recording Phase 10 completion
</commit_message>
<xml_diff>
--- a/LifeOS_Memory.docx
+++ b/LifeOS_Memory.docx
@@ -6060,17 +6060,7 @@
         <w:pStyle w:val="FirstParagraph"/>
       </w:pPr>
       <w:r>
-        <w:rPr>
-          <w:bCs/>
-          <w:b/>
-        </w:rPr>
-        <w:t xml:space="preserve">Status:</w:t>
-      </w:r>
-      <w:r>
-        <w:t xml:space="preserve"> </w:t>
-      </w:r>
-      <w:r>
-        <w:t xml:space="preserve">NOT STARTED</w:t>
+        <w:t>Status: COMPLETED</w:t>
       </w:r>
     </w:p>
     <w:p>
@@ -13058,6 +13048,60 @@
         <w:t>Next Step: Phase 10 - Emergency Mode (Emergency Mode State Schema, Model, Repository, Service, Controllers, Emergency Activation &amp; De-escalation Frontend)</w:t>
         <w:br/>
         <w:t>Overall Status: Phase 9 COMPLETED. Ready for Phase 10.</w:t>
+      </w:r>
+    </w:p>
+    <w:p>
+      <w:r>
+        <w:t>Session Update - 2026-09-09 (Phase 10 Completion)</w:t>
+      </w:r>
+    </w:p>
+    <w:p>
+      <w:r>
+        <w:t>Date: 2026-09-09</w:t>
+        <w:br/>
+        <w:t>Current Phase: Phase 10 - Emergency Mode</w:t>
+        <w:br/>
+        <w:t>Work Completed: Built full Emergency Mode module end-to-end following strict Database First order:</w:t>
+        <w:br/>
+        <w:t xml:space="preserve">  - Emergency Mode Zod validators for enable/disable endpoints (validators/emergency-mode.validator.ts)</w:t>
+        <w:br/>
+        <w:t xml:space="preserve">  - Mongoose schema &amp; model for emergency_mode_state per Backend-Schema.md Section 5.21 Table 19 with unique index on userId, priorFocusSettings, priorDigitalDetoxSettings, and priorNotificationPreferences snapshot sub-schemas (models/emergency-mode.model.ts)</w:t>
+        <w:br/>
+        <w:t xml:space="preserve">  - EmergencyModeRepository with findByUserId and upsertState operations (repositories/emergency-mode.repository.ts)</w:t>
+        <w:br/>
+        <w:t xml:space="preserve">  - EmergencyModeService implementing: getState (with default inactive creation), getStatus (DTO return), enableEmergencyMode (snapshots current Digital Detox settings, activates Focus Lock, restricts screen time goal to 30m emergency budget, persists isActive: true + activatedAt), disableEmergencyMode (restores snapshotted settings, persists isActive: false + deactivatedAt, clears snapshots), idempotent enable/disable (services/emergency-mode.service.ts)</w:t>
+        <w:br/>
+        <w:t xml:space="preserve">  - EmergencyModeController &amp; REST routes mounted under /api/v1/emergency-mode (GET /status, POST /enable, POST /disable) (routes/emergency-mode.routes.ts)</w:t>
+        <w:br/>
+        <w:t xml:space="preserve">  - Frontend Emergency Mode API client service (features/emergency-mode/services/emergency-mode.service.ts)</w:t>
+        <w:br/>
+        <w:t xml:space="preserve">  - Interactive UI components: EmergencyToggleCard (with two-step activation confirmation to prevent accidental triggers), EmergencyActiveBanner (pulsing live banner with elapsed time counter and quick de-escalate button), EmergencyProtocolsCard (dimmed inactive protocols that light up on activation, showing Focus Lock, Screen Time Restriction, Notification Silence, and Auto-Restoration), DeescalateModal (high-friction text confirmation requiring user to type RESTORE before restoring settings)</w:t>
+        <w:br/>
+        <w:t xml:space="preserve">  - Full Emergency Mode page (/emergency) with query polling every 30s and all components integrated</w:t>
+        <w:br/>
+        <w:t>Features Implemented: Emergency Mode Toggle, Settings Snapshot at Activation, Auto-Restoration on Disable, Focus Lock Enforcement, 30m Emergency Screen Time Budget, Protocol Cards, High-Friction Confirm Dialogs, Idempotent Enable/Disable.</w:t>
+        <w:br/>
+        <w:t>Files Added: 15 files across client and server (16 including routes/index.ts modification)</w:t>
+        <w:br/>
+        <w:t>Files Modified: lifeos-server/src/routes/index.ts</w:t>
+        <w:br/>
+        <w:t>Database Changes: Created emergency_mode_state collection with unique index on userId</w:t>
+        <w:br/>
+        <w:t>API Changes: Registered /api/v1/emergency-mode endpoints (GET /status, POST /enable, POST /disable)</w:t>
+        <w:br/>
+        <w:t>UI Changes: Added /emergency page with EmergencyToggleCard, EmergencyActiveBanner, EmergencyProtocolsCard, and DeescalateModal</w:t>
+        <w:br/>
+        <w:t>Tests Added: tests/emergency-mode.test.ts (4 unit tests covering initial inactive state, enable with snapshot creation, disable with snapshot restoration, and idempotent enable)</w:t>
+        <w:br/>
+        <w:t>Tests Passed: 51/51 automated unit tests passing across Phases 1 through 10; client and server builds and lints passing cleanly</w:t>
+        <w:br/>
+        <w:t>Known Issues: None</w:t>
+        <w:br/>
+        <w:t>Decisions Made: Decision 017 - Emergency Mode uses standard hard deletion per schema rules; activate snapshots Digital Detox settings and imposes 30m emergency screen time budget; disable fully restores snapshot and clears it</w:t>
+        <w:br/>
+        <w:t>Next Step: Phase 11 - Reports Module (Analytics Dashboard, Summary Reports, Date-range Filtering, Charts Data Endpoints)</w:t>
+        <w:br/>
+        <w:t>Overall Status: Phase 10 COMPLETED. Ready for Phase 11.</w:t>
       </w:r>
     </w:p>
     <w:sectPr/>

</xml_diff>

<commit_message>
docs: update Memory.docx recording Phase 11 completion
</commit_message>
<xml_diff>
--- a/LifeOS_Memory.docx
+++ b/LifeOS_Memory.docx
@@ -6086,17 +6086,7 @@
         <w:pStyle w:val="FirstParagraph"/>
       </w:pPr>
       <w:r>
-        <w:rPr>
-          <w:bCs/>
-          <w:b/>
-        </w:rPr>
-        <w:t xml:space="preserve">Status:</w:t>
-      </w:r>
-      <w:r>
-        <w:t xml:space="preserve"> </w:t>
-      </w:r>
-      <w:r>
-        <w:t xml:space="preserve">NOT STARTED</w:t>
+        <w:t>Status: COMPLETED</w:t>
       </w:r>
     </w:p>
     <w:bookmarkEnd w:id="87"/>
@@ -13102,6 +13092,62 @@
         <w:t>Next Step: Phase 11 - Reports Module (Analytics Dashboard, Summary Reports, Date-range Filtering, Charts Data Endpoints)</w:t>
         <w:br/>
         <w:t>Overall Status: Phase 10 COMPLETED. Ready for Phase 11.</w:t>
+      </w:r>
+    </w:p>
+    <w:p>
+      <w:r>
+        <w:t>Session Update - 2026-09-10 (Phase 11 Completion)</w:t>
+      </w:r>
+    </w:p>
+    <w:p>
+      <w:r>
+        <w:t>Date: 2026-09-10</w:t>
+        <w:br/>
+        <w:t>Current Phase: Phase 11 - Reports Module</w:t>
+        <w:br/>
+        <w:t>Work Completed: Implemented full Reports Module end-to-end following strict Database First order:</w:t>
+        <w:br/>
+        <w:t xml:space="preserve">  - Report Zod validator for optional date queries (validators/report.validator.ts)</w:t>
+        <w:br/>
+        <w:t xml:space="preserve">  - Mongoose schema &amp; model for reports per Backend-Schema.md Section 5.10 Table 8 with compound unique index on userId + reportType + periodStart (models/report.model.ts)</w:t>
+        <w:br/>
+        <w:t xml:space="preserve">  - ReportRepository with findByPeriod, upsertReport, and findLatest methods (repositories/report.repository.ts)</w:t>
+        <w:br/>
+        <w:t xml:space="preserve">  - ReportService aggregating real data across Task, Habit, HabitHistory, WaterLog, SleepLog, MoodLog, FocusSession, ScreenTimeLog, and DigitalDetoxSettings:</w:t>
+        <w:br/>
+        <w:t xml:space="preserve">    * getDashboardSummary: live today metrics (tasks total/completed, habits total/completed, water intake, today and weekly focus minutes, latest mood score, highest current streak)</w:t>
+        <w:br/>
+        <w:t xml:space="preserve">    * generateReport: period calculators for daily, weekly (Monday to Sunday), monthly (1st to month end), and yearly (Jan 1 to Dec 31), enforcing minimum activity thresholds with graceful zero-illusion responses when insufficient data exists</w:t>
+        <w:br/>
+        <w:t xml:space="preserve">  - ReportController &amp; REST routes mounted under /api/v1/reports (GET /dashboard, GET /:type) (controllers/report.controller.ts, routes/report.routes.ts)</w:t>
+        <w:br/>
+        <w:t xml:space="preserve">  - Frontend Report API client service (features/reports/services/report.service.ts)</w:t>
+        <w:br/>
+        <w:t xml:space="preserve">  - UI components: DashboardStatsGrid (6 responsive cards with hydration, tasks, habits, streak, focus, and mood), ReportSummaryCard (breakdown of tasks completion rate, habit check-ins, sleep averages, water, focus sessions, screen time averages, and graceful empty states), Reports dashboard page (/reports) with tab switching between Daily, Weekly, Monthly, and Yearly reports and live manual refresh</w:t>
+        <w:br/>
+        <w:t>Features Implemented: Dashboard Analytics, Daily/Weekly/Monthly/Yearly Report Generators, Zero-Fake Data / Zero-Illusion Rule Enforcement, Informative Empty States, Compound Period Indexing.</w:t>
+        <w:br/>
+        <w:t>Files Added: 13 files across client and server (14 including routes/index.ts modification)</w:t>
+        <w:br/>
+        <w:t>Files Modified: lifeos-server/src/routes/index.ts</w:t>
+        <w:br/>
+        <w:t>Database Changes: Created reports collection with compound unique index on { userId: 1, reportType: 1, periodStart: 1 }</w:t>
+        <w:br/>
+        <w:t>API Changes: Registered /api/v1/reports endpoints (GET /dashboard, GET /:type)</w:t>
+        <w:br/>
+        <w:t>UI Changes: Created /reports page with live today stats grid and period report tabs</w:t>
+        <w:br/>
+        <w:t>Tests Added: tests/report.test.ts (6 unit tests covering daily, weekly, and monthly period boundaries, upsert behavior, empty state assertions, and all 4 report types)</w:t>
+        <w:br/>
+        <w:t>Tests Passed: 57/57 automated unit tests passing; client and server builds and lints passing cleanly</w:t>
+        <w:br/>
+        <w:t>Known Issues: None</w:t>
+        <w:br/>
+        <w:t>Decisions Made: Decision 018 - Reports module strictly uses real database aggregations; insufficient data returns informative empty state; compound unique index prevents duplicate periodic reports</w:t>
+        <w:br/>
+        <w:t>Next Step: Phase 12 - Notifications Module (In-app alerts, reminder scheduler, notification preferences)</w:t>
+        <w:br/>
+        <w:t>Overall Status: Phase 11 COMPLETED. Ready for Phase 12.</w:t>
       </w:r>
     </w:p>
     <w:sectPr/>

</xml_diff>

<commit_message>
docs: update Memory.docx recording Phase 12 completion
</commit_message>
<xml_diff>
--- a/LifeOS_Memory.docx
+++ b/LifeOS_Memory.docx
@@ -6104,17 +6104,7 @@
         <w:pStyle w:val="FirstParagraph"/>
       </w:pPr>
       <w:r>
-        <w:rPr>
-          <w:bCs/>
-          <w:b/>
-        </w:rPr>
-        <w:t xml:space="preserve">Status:</w:t>
-      </w:r>
-      <w:r>
-        <w:t xml:space="preserve"> </w:t>
-      </w:r>
-      <w:r>
-        <w:t xml:space="preserve">NOT STARTED</w:t>
+        <w:t>Status: COMPLETED</w:t>
       </w:r>
     </w:p>
     <w:bookmarkEnd w:id="88"/>
@@ -13148,6 +13138,72 @@
         <w:t>Next Step: Phase 12 - Notifications Module (In-app alerts, reminder scheduler, notification preferences)</w:t>
         <w:br/>
         <w:t>Overall Status: Phase 11 COMPLETED. Ready for Phase 12.</w:t>
+      </w:r>
+    </w:p>
+    <w:p>
+      <w:r>
+        <w:t>Session Update - 2026-09-10 (Phase 12 Completion)</w:t>
+      </w:r>
+    </w:p>
+    <w:p>
+      <w:r>
+        <w:t>Date: 2026-09-10</w:t>
+        <w:br/>
+        <w:t>Current Phase: Phase 12 - Notifications Module</w:t>
+        <w:br/>
+        <w:t>Work Completed: Implemented full Notifications Module end-to-end following strict Database First order:</w:t>
+        <w:br/>
+        <w:t xml:space="preserve">  - Notification Zod validators for notification creation and preferences update (validators/notification.validator.ts)</w:t>
+        <w:br/>
+        <w:t xml:space="preserve">  - Mongoose schemas &amp; models for notifications and notification_preferences per Backend-Schema.md Sections 5.16 &amp; 5.18 (models/notification.model.ts, models/notification-preferences.model.ts)</w:t>
+        <w:br/>
+        <w:t xml:space="preserve">  - NotificationRepository implementing: create, findByUserId, findUnreadByUserId, markAsRead, markAllAsRead, delete, countUnread, getPreferences, and upsertPreferences (repositories/notification.repository.ts)</w:t>
+        <w:br/>
+        <w:t xml:space="preserve">  - NotificationService implementing: notification queries, batch read-marking, unread counts, and preference-aware notification delivery where disabled reminder types are suppressed (services/notification.service.ts)</w:t>
+        <w:br/>
+        <w:t xml:space="preserve">  - NotificationController &amp; REST routes mounted under /api/v1/notifications:</w:t>
+        <w:br/>
+        <w:t xml:space="preserve">    * GET /preferences, PATCH /preferences</w:t>
+        <w:br/>
+        <w:t xml:space="preserve">    * GET /, GET /unread, GET /unread-count</w:t>
+        <w:br/>
+        <w:t xml:space="preserve">    * PATCH /read-all, PATCH /:notificationId/read, DELETE /:notificationId</w:t>
+        <w:br/>
+        <w:t xml:space="preserve">  - Frontend Notification API client service (features/notifications/services/notification.service.ts)</w:t>
+        <w:br/>
+        <w:t xml:space="preserve">  - UI components:</w:t>
+        <w:br/>
+        <w:t xml:space="preserve">    * NotificationBadge: live unread counter polling every 15s in TopBar header with link to notification centre</w:t>
+        <w:br/>
+        <w:t xml:space="preserve">    * NotificationItem: interactive notification card with read status, type badge, timestamps, direct action links, mark-as-read, and delete actions</w:t>
+        <w:br/>
+        <w:t xml:space="preserve">    * NotificationPreferencesCard: interactive toggle controls for Email, Browser, Habit Reminders, Task Reminders, and Weekly Reports</w:t>
+        <w:br/>
+        <w:t xml:space="preserve">    * NotificationsPage (/notifications): full Notification Centre with unread/all filters, mark-all-as-read button, preferences drawer, and empty states</w:t>
+        <w:br/>
+        <w:t>Features Implemented: Notification Centre, Unread Notification Badge, Notification Categories (Reminder, Achievement, AI Insight, Challenge, Group, System), Notification Preferences &amp; Channels, Suppression Rules for Disabled Preferences.</w:t>
+        <w:br/>
+        <w:t>Files Added: 15 files across client and server</w:t>
+        <w:br/>
+        <w:t>Files Modified: lifeos-server/src/routes/index.ts, lifeos-client/src/components/layout/topbar.tsx</w:t>
+        <w:br/>
+        <w:t>Database Changes: Created notifications collection and notification_preferences collection</w:t>
+        <w:br/>
+        <w:t>API Changes: Registered /api/v1/notifications endpoints (GET /, GET /unread, GET /unread-count, PATCH /read-all, PATCH /:notificationId/read, DELETE /:notificationId, GET /preferences, PATCH /preferences)</w:t>
+        <w:br/>
+        <w:t>UI Changes: Created /notifications page, updated TopBar with live NotificationBadge</w:t>
+        <w:br/>
+        <w:t>Tests Added: tests/notification.test.ts (6 unit tests covering default preferences, preference updates, system delivery, preference suppression, single mark-as-read, mark-all-as-read, and deletion)</w:t>
+        <w:br/>
+        <w:t>Tests Passed: 63/63 automated unit tests passing; client and server builds and lints passing cleanly</w:t>
+        <w:br/>
+        <w:t>Known Issues: None</w:t>
+        <w:br/>
+        <w:t>Decisions Made: Decision 019 - Notification delivery checks preferences before writing to notifications collection; default preferences set all categories and channels to true; unread badge dynamically polls unread count endpoint</w:t>
+        <w:br/>
+        <w:t>Next Step: Phase 13 - Groups Module (Community Groups, Group Chat/Feed, Leaderboards, Voting)</w:t>
+        <w:br/>
+        <w:t>Overall Status: Phase 12 COMPLETED. Ready for Phase 13.</w:t>
       </w:r>
     </w:p>
     <w:sectPr/>

</xml_diff>

<commit_message>
docs: update Memory.docx recording Phase 13 completion
</commit_message>
<xml_diff>
--- a/LifeOS_Memory.docx
+++ b/LifeOS_Memory.docx
@@ -6122,17 +6122,7 @@
         <w:pStyle w:val="FirstParagraph"/>
       </w:pPr>
       <w:r>
-        <w:rPr>
-          <w:bCs/>
-          <w:b/>
-        </w:rPr>
-        <w:t xml:space="preserve">Status:</w:t>
-      </w:r>
-      <w:r>
-        <w:t xml:space="preserve"> </w:t>
-      </w:r>
-      <w:r>
-        <w:t xml:space="preserve">NOT STARTED</w:t>
+        <w:t>Status: COMPLETED</w:t>
       </w:r>
     </w:p>
     <w:bookmarkEnd w:id="89"/>
@@ -13204,6 +13194,78 @@
         <w:t>Next Step: Phase 13 - Groups Module (Community Groups, Group Chat/Feed, Leaderboards, Voting)</w:t>
         <w:br/>
         <w:t>Overall Status: Phase 12 COMPLETED. Ready for Phase 13.</w:t>
+      </w:r>
+    </w:p>
+    <w:p>
+      <w:r>
+        <w:t>Session Update - 2026-09-10 (Phase 13 Completion)</w:t>
+      </w:r>
+    </w:p>
+    <w:p>
+      <w:r>
+        <w:t>Date: 2026-09-10</w:t>
+        <w:br/>
+        <w:t>Current Phase: Phase 13 - Groups Module</w:t>
+        <w:br/>
+        <w:t>Work Completed: Implemented full Groups Module end-to-end following strict Database First order:</w:t>
+        <w:br/>
+        <w:t xml:space="preserve">  - Group Zod validators for create, update, inviteCode join, role update, and goal voting (validators/group.validator.ts)</w:t>
+        <w:br/>
+        <w:t xml:space="preserve">  - Mongoose schemas &amp; models for groups, group_members, and votes per Backend-Schema.md Sections 5.13, 5.14, and 5.19 with indexes on ownerId, inviteCode (unique), groupId+userId (unique), and groupId+userId+votingPeriodStart (unique) (models/group.model.ts, models/group-member.model.ts, models/vote.model.ts)</w:t>
+        <w:br/>
+        <w:t xml:space="preserve">  - GroupRepository implementing: group CRUD, membership tracking, member role updates, member counts, member deletion on group cascade, and weekly goal vote records (repositories/group.repository.ts)</w:t>
+        <w:br/>
+        <w:t xml:space="preserve">  - GroupService implementing:</w:t>
+        <w:br/>
+        <w:t xml:space="preserve">    * Group creation with 8-character unique alphanumeric invite code generation and auto-assignment of creator as 'Owner' member</w:t>
+        <w:br/>
+        <w:t xml:space="preserve">    * Group details retrieval with permission check (private/invite-only membership gates)</w:t>
+        <w:br/>
+        <w:t xml:space="preserve">    * Real activity leaderboard calculator using zero-illusion formula: (Tasks Completed * 10) + (Focus Minutes * 1) + (Streak Days * 5)</w:t>
+        <w:br/>
+        <w:t xml:space="preserve">    * Weekly goal voting system with dynamic weekly voting period start date (Mondays) and duplicate-vote prevention</w:t>
+        <w:br/>
+        <w:t xml:space="preserve">    * Membership controls: join with code, capacity limits enforcement, leave group (blocking Owner from leaving without transfer/delete), remove member (Owner/Admin only), and update member roles</w:t>
+        <w:br/>
+        <w:t xml:space="preserve">  - GroupController &amp; REST routes mounted under /api/v1/groups (POST /, GET /, POST /join, GET /:groupId, PATCH /:groupId, DELETE /:groupId, POST /:groupId/leave, DELETE /:groupId/members/:userId, PATCH /:groupId/members/:userId, POST /:groupId/goals/vote)</w:t>
+        <w:br/>
+        <w:t xml:space="preserve">  - Frontend Group API client service (features/groups/services/group.service.ts)</w:t>
+        <w:br/>
+        <w:t xml:space="preserve">  - UI components:</w:t>
+        <w:br/>
+        <w:t xml:space="preserve">    * GroupCard: displays name, description, privacy badge, member limit, and link to group dashboard</w:t>
+        <w:br/>
+        <w:t xml:space="preserve">    * CreateGroupDialog: modal form for group name, description, privacy, and max member capacity</w:t>
+        <w:br/>
+        <w:t xml:space="preserve">    * JoinGroupDialog: invite code input dialog with uppercase formatting and auto-validation</w:t>
+        <w:br/>
+        <w:t xml:space="preserve">    * GroupsPage (/groups): accountability groups index with empty state, create and join buttons, and grid</w:t>
+        <w:br/>
+        <w:t xml:space="preserve">    * GroupDetailsPage (/groups/[groupId]): full group dashboard with header banner, invite code copy action, tabs for Activity Leaderboard, Weekly Goal Voting, and Members list</w:t>
+        <w:br/>
+        <w:t>Features Implemented: Accountability Groups, Invite Codes, Group Roles (Owner, Admin, Moderator, Member), Real Activity Leaderboard, Weekly Goal Voting, Capacity Limit Enforcement.</w:t>
+        <w:br/>
+        <w:t>Files Added: 16 files across client and server</w:t>
+        <w:br/>
+        <w:t>Files Modified: lifeos-server/src/routes/index.ts</w:t>
+        <w:br/>
+        <w:t>Database Changes: Created groups, group_members, and votes collections with respective unique and relational indexes</w:t>
+        <w:br/>
+        <w:t>API Changes: Registered /api/v1/groups endpoints for groups CRUD, membership, leaving, removing members, role management, and goal voting</w:t>
+        <w:br/>
+        <w:t>UI Changes: Created /groups and /groups/[groupId] routes with interactive dialogs and leaderboard tabs</w:t>
+        <w:br/>
+        <w:t>Tests Added: tests/group.test.ts (7 unit tests covering creation with invite code, joining, invalid codes, duplicate joins, role updates, voting, and leave restrictions)</w:t>
+        <w:br/>
+        <w:t>Tests Passed: 70/70 automated unit tests passing across Phases 1–13; client and server builds and lints passing cleanly</w:t>
+        <w:br/>
+        <w:t>Known Issues: None</w:t>
+        <w:br/>
+        <w:t>Decisions Made: Decision 020 - Group creation assigns creator as Owner; groups enforce max member limits; leaderboard scores derive solely from verified tasks, focus sessions, and active habit streaks per zero-fake-data policy</w:t>
+        <w:br/>
+        <w:t>Next Step: Phase 14 - Challenges Module (Challenge CRUD, Join/Leave Challenges, Progress Tracking, Challenge Leaderboards)</w:t>
+        <w:br/>
+        <w:t>Overall Status: Phase 13 COMPLETED. Ready for Phase 14.</w:t>
       </w:r>
     </w:p>
     <w:sectPr/>

</xml_diff>

<commit_message>
docs: update Memory.docx recording Phase 14 completion
</commit_message>
<xml_diff>
--- a/LifeOS_Memory.docx
+++ b/LifeOS_Memory.docx
@@ -6140,17 +6140,7 @@
         <w:pStyle w:val="FirstParagraph"/>
       </w:pPr>
       <w:r>
-        <w:rPr>
-          <w:bCs/>
-          <w:b/>
-        </w:rPr>
-        <w:t xml:space="preserve">Status:</w:t>
-      </w:r>
-      <w:r>
-        <w:t xml:space="preserve"> </w:t>
-      </w:r>
-      <w:r>
-        <w:t xml:space="preserve">NOT STARTED</w:t>
+        <w:t>Status: COMPLETED</w:t>
       </w:r>
     </w:p>
     <w:bookmarkEnd w:id="90"/>
@@ -13266,6 +13256,86 @@
         <w:t>Next Step: Phase 14 - Challenges Module (Challenge CRUD, Join/Leave Challenges, Progress Tracking, Challenge Leaderboards)</w:t>
         <w:br/>
         <w:t>Overall Status: Phase 13 COMPLETED. Ready for Phase 14.</w:t>
+      </w:r>
+    </w:p>
+    <w:p>
+      <w:r>
+        <w:t>Session Update - 2026-09-10 (Phase 14 Completion)</w:t>
+      </w:r>
+    </w:p>
+    <w:p>
+      <w:r>
+        <w:t>Date: 2026-09-10</w:t>
+        <w:br/>
+        <w:t>Current Phase: Phase 14 - Challenges Module</w:t>
+        <w:br/>
+        <w:t>Work Completed: Implemented full Challenges Module end-to-end following strict Database First order:</w:t>
+        <w:br/>
+        <w:t xml:space="preserve">  - Challenge Zod validators for create, update, progress, and query filters (validators/challenge.validator.ts)</w:t>
+        <w:br/>
+        <w:t xml:space="preserve">  - Mongoose schemas &amp; models for challenges and challenge_participants per Backend-Schema.md Sections 5.11 &amp; 5.12 with indexes on creatorId+visibility+category, challengeId+userId (unique), and challengeId+progress (models/challenge.model.ts, models/challenge-participant.model.ts)</w:t>
+        <w:br/>
+        <w:t xml:space="preserve">  - ChallengeRepository implementing: challenge CRUD, participant tracking, progress updating (auto-marking completion at 100%), participant counts, cascading participant deletions, and ranked participant queries (repositories/challenge.repository.ts)</w:t>
+        <w:br/>
+        <w:t xml:space="preserve">  - ChallengeService implementing:</w:t>
+        <w:br/>
+        <w:t xml:space="preserve">    * Challenge creation with automatic enrollment of creator as participant</w:t>
+        <w:br/>
+        <w:t xml:space="preserve">    * Challenge browser with category and active/upcoming/ended status filters</w:t>
+        <w:br/>
+        <w:t xml:space="preserve">    * Individual challenge details with participant status and user progress</w:t>
+        <w:br/>
+        <w:t xml:space="preserve">    * Progress tracking with automatic milestone completion flags and completion timestamps</w:t>
+        <w:br/>
+        <w:t xml:space="preserve">    * Challenge leaderboard logic ranking participants strictly by progress percentage (acceptance criteria: progress automatically updates leaderboards)</w:t>
+        <w:br/>
+        <w:t xml:space="preserve">    * Join and leave operations with duplicate join prevention</w:t>
+        <w:br/>
+        <w:t xml:space="preserve">  - ChallengeController &amp; REST routes mounted under /api/v1/challenges:</w:t>
+        <w:br/>
+        <w:t xml:space="preserve">    * POST /, GET /</w:t>
+        <w:br/>
+        <w:t xml:space="preserve">    * GET /:challengeId, PATCH /:challengeId, DELETE /:challengeId</w:t>
+        <w:br/>
+        <w:t xml:space="preserve">    * POST /:challengeId/join, POST /:challengeId/leave</w:t>
+        <w:br/>
+        <w:t xml:space="preserve">    * PATCH /:challengeId/progress, GET /:challengeId/leaderboard</w:t>
+        <w:br/>
+        <w:t xml:space="preserve">  - Frontend Challenge API client service (features/challenges/services/challenge.service.ts)</w:t>
+        <w:br/>
+        <w:t xml:space="preserve">  - UI components:</w:t>
+        <w:br/>
+        <w:t xml:space="preserve">    * ChallengeCard: displays title, description, category, difficulty badges, dates, enrollment status, reward, and participant counts</w:t>
+        <w:br/>
+        <w:t xml:space="preserve">    * CreateChallengeDialog: modal form for title, description, category, difficulty, visibility, dates, and reward badge</w:t>
+        <w:br/>
+        <w:t xml:space="preserve">    * ChallengesPage (/challenges): main challenge browser with category pills (Productivity, Fitness, Learning, etc.), status filter buttons, and responsive grid</w:t>
+        <w:br/>
+        <w:t xml:space="preserve">    * ChallengeDetailsPage (/challenges/[challengeId]): full challenge dashboard featuring join/leave controls, interactive user progress tracker (quick set buttons for 25%, 50%, 75%, 100%), and real-time Participant Leaderboard</w:t>
+        <w:br/>
+        <w:t>Features Implemented: Challenge CRUD, Auto-Enrollment, Category &amp; Difficulty Filtering, Progress Tracking, Auto-Completion at 100%, Participant Leaderboard, Empty States.</w:t>
+        <w:br/>
+        <w:t>Files Added: 15 files across client and server</w:t>
+        <w:br/>
+        <w:t>Files Modified: lifeos-server/src/routes/index.ts</w:t>
+        <w:br/>
+        <w:t>Database Changes: Created challenges and challenge_participants collections with compound unique and sorting indexes</w:t>
+        <w:br/>
+        <w:t>API Changes: Registered /api/v1/challenges endpoints for challenge management, enrollment, progress tracking, and leaderboard</w:t>
+        <w:br/>
+        <w:t>UI Changes: Created /challenges and /challenges/[challengeId] routes with dialogs and progress bars</w:t>
+        <w:br/>
+        <w:t>Tests Added: tests/challenge.test.ts (7 unit tests covering creation, auto-enrollment, joining, duplicate join prevention, progress updates to 100%, leaderboard rankings, leaving, and creator-only deletion)</w:t>
+        <w:br/>
+        <w:t>Tests Passed: 77/77 automated unit tests passing across Phases 1–14; client and server builds and lints passing cleanly</w:t>
+        <w:br/>
+        <w:t>Known Issues: None</w:t>
+        <w:br/>
+        <w:t>Decisions Made: Decision 021 - Challenges enforce end date &gt; start date; creator is automatically enrolled; reaching 100% progress automatically marks participant record as completed with completion timestamp; leaderboards update dynamically</w:t>
+        <w:br/>
+        <w:t>Next Step: Phase 15 - AI Integration (BYOK Architecture, AI Settings, Encrypted API Keys, Weekly AI Reports)</w:t>
+        <w:br/>
+        <w:t>Overall Status: Phase 14 COMPLETED. Ready for Phase 15.</w:t>
       </w:r>
     </w:p>
     <w:sectPr/>

</xml_diff>

<commit_message>
docs: update Memory.docx recording Phase 15 completion
</commit_message>
<xml_diff>
--- a/LifeOS_Memory.docx
+++ b/LifeOS_Memory.docx
@@ -6158,17 +6158,7 @@
         <w:pStyle w:val="FirstParagraph"/>
       </w:pPr>
       <w:r>
-        <w:rPr>
-          <w:bCs/>
-          <w:b/>
-        </w:rPr>
-        <w:t xml:space="preserve">Status:</w:t>
-      </w:r>
-      <w:r>
-        <w:t xml:space="preserve"> </w:t>
-      </w:r>
-      <w:r>
-        <w:t xml:space="preserve">NOT STARTED</w:t>
+        <w:t>Status: COMPLETED</w:t>
       </w:r>
     </w:p>
     <w:bookmarkEnd w:id="91"/>
@@ -13336,6 +13326,80 @@
         <w:t>Next Step: Phase 15 - AI Integration (BYOK Architecture, AI Settings, Encrypted API Keys, Weekly AI Reports)</w:t>
         <w:br/>
         <w:t>Overall Status: Phase 14 COMPLETED. Ready for Phase 15.</w:t>
+      </w:r>
+    </w:p>
+    <w:p>
+      <w:r>
+        <w:t>Session Update - 2026-09-10 (Phase 15 Completion)</w:t>
+      </w:r>
+    </w:p>
+    <w:p>
+      <w:r>
+        <w:t>Date: 2026-09-10</w:t>
+        <w:br/>
+        <w:t>Current Phase: Phase 15 - AI Integration</w:t>
+        <w:br/>
+        <w:t>Work Completed: Implemented full AI Integration Module end-to-end following strict Database First order:</w:t>
+        <w:br/>
+        <w:t xml:space="preserve">  - Encryption utility in src/utils/encryption.ts implementing military-grade AES-256-GCM symmetric encryption with initialization vector (IV) and authentication tags</w:t>
+        <w:br/>
+        <w:t xml:space="preserve">  - AI Zod validators for BYOK settings (OpenAI, Gemini, Claude, Groq, OpenRouter) and coaching queries (validators/ai.validator.ts)</w:t>
+        <w:br/>
+        <w:t xml:space="preserve">  - Mongoose schema &amp; model for ai_settings per Backend-Schema.md Section 5.17 with unique index on userId and compound index on userId+provider (models/ai-settings.model.ts)</w:t>
+        <w:br/>
+        <w:t xml:space="preserve">  - AISettingsRepository implementing secure upsert and retrieval of encrypted API keys without exposing plain text (repositories/ai-settings.repository.ts)</w:t>
+        <w:br/>
+        <w:t xml:space="preserve">  - AIService implementing:</w:t>
+        <w:br/>
+        <w:t xml:space="preserve">    * Bring Your Own Key (BYOK) lifecycle with safe public DTOs (plain-text API keys are never returned)</w:t>
+        <w:br/>
+        <w:t xml:space="preserve">    * Weekly AI Report Generator analyzing verified database records across tasks, habits, focus sessions, and hydration</w:t>
+        <w:br/>
+        <w:t xml:space="preserve">    * AI Productivity Coach analyzing real user metrics to formulate personalized, grounded responses</w:t>
+        <w:br/>
+        <w:t xml:space="preserve">    * AI Health Analysis analyzing trends from Sleep, Water, and Mood over 14-day lookback windows</w:t>
+        <w:br/>
+        <w:t xml:space="preserve">    * Guardrails: AI features remain strictly optional; queries are rejected with informative errors when AI is not configured or disabled; AI never fabricates data</w:t>
+        <w:br/>
+        <w:t xml:space="preserve">  - AIController &amp; REST routes mounted under /api/v1/ai:</w:t>
+        <w:br/>
+        <w:t xml:space="preserve">    * GET /settings, POST /settings, PATCH /settings, DELETE /settings</w:t>
+        <w:br/>
+        <w:t xml:space="preserve">    * POST /reports/weekly, POST /coach, POST /health-analysis</w:t>
+        <w:br/>
+        <w:t xml:space="preserve">  - Frontend AI API client service (features/ai/services/ai.service.ts)</w:t>
+        <w:br/>
+        <w:t xml:space="preserve">  - UI components:</w:t>
+        <w:br/>
+        <w:t xml:space="preserve">    * AISetupCard: BYOK configuration card with provider select (Gemini, OpenAI, Claude, Groq, OpenRouter), model select, secure key masking, active provider badge, and key deletion</w:t>
+        <w:br/>
+        <w:t xml:space="preserve">    * AICoachCard: interactive coaching panel with sample question chips, live input, loading state, grounded response render, and weekly context badges (tasks, focus mins, habits, hydration)</w:t>
+        <w:br/>
+        <w:t xml:space="preserve">    * AICoachPage (/ai-coach): full AI hub page with setup card, coach panel, and inactive warning states</w:t>
+        <w:br/>
+        <w:t>Features Implemented: Bring Your Own Key (BYOK) Model, AES-256-GCM Key Encryption, Multi-Provider Support (Gemini, OpenAI, Claude, Groq, OpenRouter), Weekly AI Reports, AI Productivity Coach, Grounded Real Data Analysis, Zero-Fake Data Guardrails.</w:t>
+        <w:br/>
+        <w:t>Files Added: 15 files across client and server</w:t>
+        <w:br/>
+        <w:t>Files Modified: lifeos-server/src/routes/index.ts</w:t>
+        <w:br/>
+        <w:t>Database Changes: Created ai_settings collection with unique index on userId and compound index on { userId: 1, provider: 1 }</w:t>
+        <w:br/>
+        <w:t>API Changes: Registered /api/v1/ai endpoints for BYOK settings, weekly AI reports, AI coach, and health analysis</w:t>
+        <w:br/>
+        <w:t>UI Changes: Created /ai-coach route linked from navigation sidebar</w:t>
+        <w:br/>
+        <w:t>Tests Added: tests/ai.test.ts (6 unit tests covering AES-256-GCM encryption/decryption roundtrip, disabled default state, encrypted key saving without plain-text leakage, model updates, key deletion, and rejection when unconfigured)</w:t>
+        <w:br/>
+        <w:t>Tests Passed: 83/83 automated unit tests passing across Phases 1–15; client and server builds and lints passing cleanly</w:t>
+        <w:br/>
+        <w:t>Known Issues: None</w:t>
+        <w:br/>
+        <w:t>Decisions Made: Decision 022 - Plain-text API keys are never stored or returned; AES-256-GCM encryption secures keys in MongoDB; AI analysis strictly grounds on verified database metrics; LifeOS remains 100% functional without AI</w:t>
+        <w:br/>
+        <w:t>Next Step: Phase 16 - Achievements &amp; Gamification (Badge Engine, Achievement Rules, Streak Rewards, Gamification Dashboard)</w:t>
+        <w:br/>
+        <w:t>Overall Status: Phase 15 COMPLETED. Ready for Phase 16.</w:t>
       </w:r>
     </w:p>
     <w:sectPr/>

</xml_diff>

<commit_message>
docs: update Memory.docx recording Phase 16 completion
</commit_message>
<xml_diff>
--- a/LifeOS_Memory.docx
+++ b/LifeOS_Memory.docx
@@ -6176,17 +6176,7 @@
         <w:pStyle w:val="FirstParagraph"/>
       </w:pPr>
       <w:r>
-        <w:rPr>
-          <w:bCs/>
-          <w:b/>
-        </w:rPr>
-        <w:t xml:space="preserve">Status:</w:t>
-      </w:r>
-      <w:r>
-        <w:t xml:space="preserve"> </w:t>
-      </w:r>
-      <w:r>
-        <w:t xml:space="preserve">NOT STARTED</w:t>
+        <w:t>Status: COMPLETED</w:t>
       </w:r>
     </w:p>
     <w:bookmarkEnd w:id="92"/>
@@ -13400,6 +13390,76 @@
         <w:t>Next Step: Phase 16 - Achievements &amp; Gamification (Badge Engine, Achievement Rules, Streak Rewards, Gamification Dashboard)</w:t>
         <w:br/>
         <w:t>Overall Status: Phase 15 COMPLETED. Ready for Phase 16.</w:t>
+      </w:r>
+    </w:p>
+    <w:p>
+      <w:r>
+        <w:t>Session Update - 2026-09-10 (Phase 16 Completion)</w:t>
+      </w:r>
+    </w:p>
+    <w:p>
+      <w:r>
+        <w:t>Date: 2026-09-10</w:t>
+        <w:br/>
+        <w:t>Current Phase: Phase 16 - Achievements &amp; Gamification Module</w:t>
+        <w:br/>
+        <w:t>Work Completed: Implemented full Achievements &amp; Gamification Module end-to-end following strict Database First order:</w:t>
+        <w:br/>
+        <w:t xml:space="preserve">  - Achievements Zod validators for query filters (validators/achievement.validator.ts)</w:t>
+        <w:br/>
+        <w:t xml:space="preserve">  - Mongoose schema &amp; model for achievements per Backend-Schema.md Section 5.15 Table 13 with compound unique index on { userId: 1, badgeId: 1 } and category index (models/achievement.model.ts)</w:t>
+        <w:br/>
+        <w:t xml:space="preserve">  - AchievementRepository implementing: read-only user achievement retrieval, single achievement lookup, category filtering, unlock record creation, and batch badge lookup (repositories/achievement.repository.ts)</w:t>
+        <w:br/>
+        <w:t xml:space="preserve">  - AchievementService implementing:</w:t>
+        <w:br/>
+        <w:t xml:space="preserve">    * System Badge Registry containing 10 canonical badges (First Step, Task Master, Century Club, Habit Starter, Streak Keeper, Focus Novice, Deep Worker, Hydration Hero, Challenger, Journey Begins)</w:t>
+        <w:br/>
+        <w:t xml:space="preserve">    * Real-time activity evaluation engine evaluating verified MongoDB records across tasks, habits, focus sessions, hydration, and challenges</w:t>
+        <w:br/>
+        <w:t xml:space="preserve">    * Zero-Fake Data / Zero-Illusion enforcement: badges can never be manually forged or awarded without verified prerequisite milestones</w:t>
+        <w:br/>
+        <w:t xml:space="preserve">    * Per Implementation.md Section 375, omitted XP/leveling system as it is strictly not in the Version 1 schema</w:t>
+        <w:br/>
+        <w:t xml:space="preserve">    * Automatic achievement unlocking and unlocking timestamp tracking</w:t>
+        <w:br/>
+        <w:t xml:space="preserve">    * Read-only public API endpoints per API.md Table 16</w:t>
+        <w:br/>
+        <w:t xml:space="preserve">  - AchievementController &amp; REST routes mounted under /api/v1/achievements:</w:t>
+        <w:br/>
+        <w:t xml:space="preserve">    * GET /, GET /:achievementId</w:t>
+        <w:br/>
+        <w:t xml:space="preserve">  - Frontend Achievement API client service (features/achievements/services/achievement.service.ts)</w:t>
+        <w:br/>
+        <w:t xml:space="preserve">  - UI components:</w:t>
+        <w:br/>
+        <w:t xml:space="preserve">    * AchievementCard: shows badge icon, title, description, category, unlock status, unlocked date, and progress indicator</w:t>
+        <w:br/>
+        <w:t xml:space="preserve">    * AchievementsPage (/achievements): full achievements gallery with category filtering tabs (All, Tasks, Habits, Focus, Health, Challenges), summary metrics banner (unlocked count, total count, completion rate), and responsive grid</w:t>
+        <w:br/>
+        <w:t>Features Implemented: System Badge Registry (10 canonical badges), Activity-Based Badge Evaluation Engine, Read-Only Achievements API, Gamification Gallery with Filter Tabs, Zero-Fake Data Integrity.</w:t>
+        <w:br/>
+        <w:t>Files Added: 12 files across client and server</w:t>
+        <w:br/>
+        <w:t>Files Modified: lifeos-server/src/routes/index.ts, lifeos-client/src/components/layout/sidebar.tsx</w:t>
+        <w:br/>
+        <w:t>Database Changes: Created achievements collection with compound unique index on { userId: 1, badgeId: 1 }</w:t>
+        <w:br/>
+        <w:t>API Changes: Registered /api/v1/achievements endpoints for achievements listing and single achievement retrieval</w:t>
+        <w:br/>
+        <w:t>UI Changes: Created /achievements route linked from navigation sidebar</w:t>
+        <w:br/>
+        <w:t>Tests Added: tests/achievement.test.ts (4 unit tests covering badge evaluation, duplicate prevention, category filtering, and single achievement retrieval)</w:t>
+        <w:br/>
+        <w:t>Tests Passed: 87/87 automated unit tests passing across Phases 1–16; client and server builds and lints passing cleanly</w:t>
+        <w:br/>
+        <w:t>Known Issues: None</w:t>
+        <w:br/>
+        <w:t>Decisions Made: Decision 023 - Achievements collection is strictly read-only for clients; badges unlock purely from verified database activities; XP/leveling system is omitted per Section 375</w:t>
+        <w:br/>
+        <w:t>Next Step: Phase 17 - Life Timeline Module (life_timeline collection, milestone aggregation from tasks, habits, challenges, achievements, and interactive timeline page)</w:t>
+        <w:br/>
+        <w:t>Overall Status: Phase 16 COMPLETED. Ready for Phase 17.</w:t>
       </w:r>
     </w:p>
     <w:sectPr/>

</xml_diff>

<commit_message>
docs: update Memory.docx recording Phase 17 completion
</commit_message>
<xml_diff>
--- a/LifeOS_Memory.docx
+++ b/LifeOS_Memory.docx
@@ -6194,17 +6194,7 @@
         <w:pStyle w:val="FirstParagraph"/>
       </w:pPr>
       <w:r>
-        <w:rPr>
-          <w:bCs/>
-          <w:b/>
-        </w:rPr>
-        <w:t xml:space="preserve">Status:</w:t>
-      </w:r>
-      <w:r>
-        <w:t xml:space="preserve"> </w:t>
-      </w:r>
-      <w:r>
-        <w:t xml:space="preserve">NOT STARTED</w:t>
+        <w:t>Status: COMPLETED</w:t>
       </w:r>
     </w:p>
     <w:p>
@@ -13460,6 +13450,90 @@
         <w:t>Next Step: Phase 17 - Life Timeline Module (life_timeline collection, milestone aggregation from tasks, habits, challenges, achievements, and interactive timeline page)</w:t>
         <w:br/>
         <w:t>Overall Status: Phase 16 COMPLETED. Ready for Phase 17.</w:t>
+      </w:r>
+    </w:p>
+    <w:p>
+      <w:r>
+        <w:t>Session Update - 2026-09-10 (Phase 17 Completion)</w:t>
+      </w:r>
+    </w:p>
+    <w:p>
+      <w:r>
+        <w:t>Date: 2026-09-10</w:t>
+        <w:br/>
+        <w:t>Current Phase: Phase 17 - Life Timeline Module</w:t>
+        <w:br/>
+        <w:t>Work Completed: Implemented full Life Timeline Module end-to-end following strict Database First order:</w:t>
+        <w:br/>
+        <w:t xml:space="preserve">  - Timeline Zod validators for query parameters (page, limit, entryType, from, to) and entryId parameter validation (validators/timeline.validator.ts)</w:t>
+        <w:br/>
+        <w:t xml:space="preserve">  - Mongoose schema &amp; model for life_timeline collection per Backend-Schema.md Section 5.22 Table 20 with compound sorting index on { userId: 1, occurredAt: -1 }, entryType index, and compound unique index on { userId: 1, entryType: 1, sourceId: 1 } for idempotent event logging (models/timeline.model.ts)</w:t>
+        <w:br/>
+        <w:t xml:space="preserve">  - TimelineRepository implementing:</w:t>
+        <w:br/>
+        <w:t xml:space="preserve">    * Paginated query with entryType and date range filtering, sorted reverse-chronologically by occurredAt</w:t>
+        <w:br/>
+        <w:t xml:space="preserve">    * Single timeline entry retrieval with user ownership verification</w:t>
+        <w:br/>
+        <w:t xml:space="preserve">    * Idempotent entry creation with duplicate index conflict resolution</w:t>
+        <w:br/>
+        <w:t xml:space="preserve">    * Count queries</w:t>
+        <w:br/>
+        <w:t xml:space="preserve">  - TimelineService implementing:</w:t>
+        <w:br/>
+        <w:t xml:space="preserve">    * Automatic milestone synchronization engine extracting real events from:</w:t>
+        <w:br/>
+        <w:t xml:space="preserve">      - Unlocked Achievements (AchievementUnlocked)</w:t>
+        <w:br/>
+        <w:t xml:space="preserve">      - Completed Challenges (ChallengeCompleted)</w:t>
+        <w:br/>
+        <w:t xml:space="preserve">      - Priority Milestone Goals / Tasks (GoalCompleted)</w:t>
+        <w:br/>
+        <w:t xml:space="preserve">      - Habit Streak Milestones (HabitMilestone)</w:t>
+        <w:br/>
+        <w:t xml:space="preserve">    * Zero-Fake Data / Zero-Illusion enforcement: timeline entries are created automatically from completed activities only; no manual timeline creation is supported in Version 1 per PRD FR-020 and Implementation.md Section 387</w:t>
+        <w:br/>
+        <w:t xml:space="preserve">    * Read-only public API endpoints per API.md Section 18</w:t>
+        <w:br/>
+        <w:t xml:space="preserve">  - TimelineController &amp; REST routes mounted under /api/v1/life-timeline:</w:t>
+        <w:br/>
+        <w:t xml:space="preserve">    * GET / (paginated timeline feed with filters)</w:t>
+        <w:br/>
+        <w:t xml:space="preserve">    * GET /:entryId (single timeline entry)</w:t>
+        <w:br/>
+        <w:t xml:space="preserve">    * Safe Express 5 req.params array guards</w:t>
+        <w:br/>
+        <w:t xml:space="preserve">  - Frontend Timeline API client service (features/timeline/services/timeline.service.ts)</w:t>
+        <w:br/>
+        <w:t xml:space="preserve">  - UI components:</w:t>
+        <w:br/>
+        <w:t xml:space="preserve">    * TimelineCard: vertical timeline node with type-specific color palette and icons (Award, Trophy, CheckCircle2, Flame), dashed connector lines, timestamp format, and milestone descriptions</w:t>
+        <w:br/>
+        <w:t xml:space="preserve">    * TimelinePage (/timeline): full timeline view featuring milestone type filter chips (All, Achievements, Goals Completed, Habit Milestones, Challenges), total milestones counter, pagination controls, loading skeleton, and graceful empty state</w:t>
+        <w:br/>
+        <w:t>Features Implemented: Life Timeline Engine, Milestone Auto-Generation from verified records (Tasks, Habits, Challenges, Achievements), Read-Only Timeline API, Interactive Vertical Feed, Idempotent Event Deduplication, Zero-Fake Data Integrity.</w:t>
+        <w:br/>
+        <w:t>Files Added: 13 files across client and server</w:t>
+        <w:br/>
+        <w:t>Files Modified: lifeos-server/src/routes/index.ts</w:t>
+        <w:br/>
+        <w:t>Database Changes: Created life_timeline collection with compound index on { userId: 1, occurredAt: -1 } and unique index on { userId: 1, entryType: 1, sourceId: 1 }</w:t>
+        <w:br/>
+        <w:t>API Changes: Registered /api/v1/life-timeline endpoints for timeline listing and single entry retrieval</w:t>
+        <w:br/>
+        <w:t>UI Changes: Created /timeline route linked in sidebar navigation under Insights</w:t>
+        <w:br/>
+        <w:t>Tests Added: tests/timeline.test.ts (8 unit tests covering empty timeline, reverse-chronological order, duplicate prevention, entryType filtering, date range filtering, pagination, single entry retrieval, and cross-user isolation)</w:t>
+        <w:br/>
+        <w:t>Tests Passed: 95/95 automated unit tests passing across Phases 1–17; client and server builds and lints passing cleanly</w:t>
+        <w:br/>
+        <w:t>Known Issues: None</w:t>
+        <w:br/>
+        <w:t>Decisions Made: Decision 024 - Timeline entries are generated automatically from completed activities only; no manual timeline entry creation in Version 1; idempotent unique index prevents duplicate milestone events; public API is strictly read-only</w:t>
+        <w:br/>
+        <w:t>Next Step: Phase 18 - Settings Module (Profile Settings, Appearance / Dark Mode, Language, Privacy &amp; Account Deletion)</w:t>
+        <w:br/>
+        <w:t>Overall Status: Phase 17 COMPLETED. Ready for Phase 18.</w:t>
       </w:r>
     </w:p>
     <w:sectPr/>

</xml_diff>

<commit_message>
docs: update Memory.docx recording Phase 18 completion
</commit_message>
<xml_diff>
--- a/LifeOS_Memory.docx
+++ b/LifeOS_Memory.docx
@@ -6220,17 +6220,7 @@
         <w:pStyle w:val="FirstParagraph"/>
       </w:pPr>
       <w:r>
-        <w:rPr>
-          <w:bCs/>
-          <w:b/>
-        </w:rPr>
-        <w:t xml:space="preserve">Status:</w:t>
-      </w:r>
-      <w:r>
-        <w:t xml:space="preserve"> </w:t>
-      </w:r>
-      <w:r>
-        <w:t xml:space="preserve">NOT STARTED</w:t>
+        <w:t>Status: COMPLETED</w:t>
       </w:r>
     </w:p>
     <w:bookmarkEnd w:id="94"/>
@@ -13534,6 +13524,86 @@
         <w:t>Next Step: Phase 18 - Settings Module (Profile Settings, Appearance / Dark Mode, Language, Privacy &amp; Account Deletion)</w:t>
         <w:br/>
         <w:t>Overall Status: Phase 17 COMPLETED. Ready for Phase 18.</w:t>
+      </w:r>
+    </w:p>
+    <w:p>
+      <w:r>
+        <w:t>Session Update - 2026-09-10 (Phase 18 Completion)</w:t>
+      </w:r>
+    </w:p>
+    <w:p>
+      <w:r>
+        <w:t>Date: 2026-09-10</w:t>
+        <w:br/>
+        <w:t>Current Phase: Phase 18 - Settings Module</w:t>
+        <w:br/>
+        <w:t>Work Completed: Implemented full Settings Module end-to-end following strict Database First order:</w:t>
+        <w:br/>
+        <w:t xml:space="preserve">  - User and Settings Zod validators for profile updates (name, timezone, language, theme, height, weight, gender, dateOfBirth) and change-password verification (validators/user.validator.ts)</w:t>
+        <w:br/>
+        <w:t xml:space="preserve">  - Mongoose schema &amp; model update on users collection adding theme preference ('light' | 'dark' | 'system', default 'dark') (models/user.model.ts)</w:t>
+        <w:br/>
+        <w:t xml:space="preserve">  - UserService implementing:</w:t>
+        <w:br/>
+        <w:t xml:space="preserve">    * Profile retrieval returning safe user fields (toSafeObject())</w:t>
+        <w:br/>
+        <w:t xml:space="preserve">    * Profile settings update with immediate database persistence across devices</w:t>
+        <w:br/>
+        <w:t xml:space="preserve">    * Password change verifying current bcrypt password before updating and revoking active sessions (refreshTokenHash)</w:t>
+        <w:br/>
+        <w:t xml:space="preserve">    * Data Portability / Export Engine (FR-023) aggregating user profile, tasks, habits, health logs (water, sleep, mood), journals, focus sessions, achievements, and timeline entries into a downloadable offline JSON archive</w:t>
+        <w:br/>
+        <w:t xml:space="preserve">    * Right to Erasure / Account Deletion (FR-025) cascading complete deletion across all collections (tasks, habits, journals, logs, detox, emergency, reports, notifications, groups, challenges, achievements, timeline, AI settings, user document)</w:t>
+        <w:br/>
+        <w:t xml:space="preserve">  - UserController &amp; REST routes mounted under /api/v1/users:</w:t>
+        <w:br/>
+        <w:t xml:space="preserve">    * GET /me, PATCH /me</w:t>
+        <w:br/>
+        <w:t xml:space="preserve">    * POST /change-password</w:t>
+        <w:br/>
+        <w:t xml:space="preserve">    * GET /export (Data Portability)</w:t>
+        <w:br/>
+        <w:t xml:space="preserve">    * DELETE /me (Right to Erasure)</w:t>
+        <w:br/>
+        <w:t xml:space="preserve">  - Frontend Settings API client service (features/settings/services/settings.service.ts)</w:t>
+        <w:br/>
+        <w:t xml:space="preserve">  - UI components:</w:t>
+        <w:br/>
+        <w:t xml:space="preserve">    * SettingsHubPage (/settings): unified tabbed configuration interface with:</w:t>
+        <w:br/>
+        <w:t xml:space="preserve">      - Profile Tab (Full Name, verified Email, Timezone picker, Language selector, Physical &amp; Health metrics)</w:t>
+        <w:br/>
+        <w:t xml:space="preserve">      - Appearance Tab (Interactive Dark, Light, and System theme selectors with live class toggle and server persistence)</w:t>
+        <w:br/>
+        <w:t xml:space="preserve">      - Security Tab (Password change form with validation)</w:t>
+        <w:br/>
+        <w:t xml:space="preserve">      - Data &amp; Privacy Tab (FR-023 One-Click JSON Archive download button, and FR-025 Permanent Account Deletion modal with typed 'DELETE' confirmation)</w:t>
+        <w:br/>
+        <w:t xml:space="preserve">      - Direct link to AI BYOK setup</w:t>
+        <w:br/>
+        <w:t>Features Implemented: User Settings Persistence (Profile, Appearance, Language, Privacy), Theme Switcher (Dark, Light, System), Password Change Verification, GDPR FR-023 Data Portability JSON Export, GDPR FR-025 Right to Erasure Cascading Hard Deletion.</w:t>
+        <w:br/>
+        <w:t>Files Added: 5 files across client and server</w:t>
+        <w:br/>
+        <w:t>Files Modified: 6 files across client and server</w:t>
+        <w:br/>
+        <w:t>Database Changes: Added theme enum field ('light', 'dark', 'system') to users collection</w:t>
+        <w:br/>
+        <w:t>API Changes: Registered POST /change-password and GET /export under /api/v1/users</w:t>
+        <w:br/>
+        <w:t>UI Changes: Created /settings route accessible from sidebar and topbar</w:t>
+        <w:br/>
+        <w:t>Tests Added: tests/user.test.ts (6 unit tests covering profile fetch, theme/language/timezone update, password change rejection on wrong password, password update success, data export structure, and account deletion)</w:t>
+        <w:br/>
+        <w:t>Tests Passed: 101/101 automated unit tests passing across Phases 1–18; client and server builds and lints passing cleanly</w:t>
+        <w:br/>
+        <w:t>Known Issues: None</w:t>
+        <w:br/>
+        <w:t>Decisions Made: Decision 025 - All user settings (theme, language, timezone) are persisted in MongoDB to ensure settings persist after logout and login per Acceptance Criteria Section 401; Data export produces complete JSON per FR-023; Account deletion cascades hard delete across all personal collections per FR-025</w:t>
+        <w:br/>
+        <w:t>Next Step: Phase 19 - Testing &amp; Quality Assurance (Full Test Suite verification, Functional CRUD checks, UI states, Responsive verification)</w:t>
+        <w:br/>
+        <w:t>Overall Status: Phase 18 COMPLETED. Ready for Phase 19.</w:t>
       </w:r>
     </w:p>
     <w:sectPr/>

</xml_diff>

<commit_message>
docs: update Memory.docx recording Phase 19 completion
</commit_message>
<xml_diff>
--- a/LifeOS_Memory.docx
+++ b/LifeOS_Memory.docx
@@ -6238,17 +6238,7 @@
         <w:pStyle w:val="FirstParagraph"/>
       </w:pPr>
       <w:r>
-        <w:rPr>
-          <w:bCs/>
-          <w:b/>
-        </w:rPr>
-        <w:t xml:space="preserve">Status:</w:t>
-      </w:r>
-      <w:r>
-        <w:t xml:space="preserve"> </w:t>
-      </w:r>
-      <w:r>
-        <w:t xml:space="preserve">NOT STARTED</w:t>
+        <w:t>Status: COMPLETED</w:t>
       </w:r>
     </w:p>
     <w:bookmarkEnd w:id="95"/>
@@ -13604,6 +13594,70 @@
         <w:t>Next Step: Phase 19 - Testing &amp; Quality Assurance (Full Test Suite verification, Functional CRUD checks, UI states, Responsive verification)</w:t>
         <w:br/>
         <w:t>Overall Status: Phase 18 COMPLETED. Ready for Phase 19.</w:t>
+      </w:r>
+    </w:p>
+    <w:p>
+      <w:r>
+        <w:t>Session Update - 2026-09-10 (Phase 19 Completion)</w:t>
+      </w:r>
+    </w:p>
+    <w:p>
+      <w:r>
+        <w:t>Date: 2026-09-10</w:t>
+        <w:br/>
+        <w:t>Current Phase: Phase 19 - Testing &amp; Quality Assurance</w:t>
+        <w:br/>
+        <w:t>Work Completed: Executed comprehensive test suites and quality assurance audits across all 18 implemented modules:</w:t>
+        <w:br/>
+        <w:t xml:space="preserve">  - Functional Testing:</w:t>
+        <w:br/>
+        <w:t xml:space="preserve">    * CRUD operations verified across all domain entities (Tasks, Habits, Journals, Health, Focus, Detox, Emergency, Reports, Notifications, Groups, Challenges, AI, Achievements, Timeline, Settings)</w:t>
+        <w:br/>
+        <w:t xml:space="preserve">    * Zod validation schemas strictly enforced on request payloads and query parameters</w:t>
+        <w:br/>
+        <w:t xml:space="preserve">    * Authentication and session authorization verified across all protected endpoints with 401 Unauthorized / 403 Forbidden checks</w:t>
+        <w:br/>
+        <w:t xml:space="preserve">    * Zero-Fake Data / Zero-Illusion Rule verified: all user metrics, streaks, leaderboards, and timeline feeds derive strictly from verified MongoDB records</w:t>
+        <w:br/>
+        <w:t xml:space="preserve">  - Automated Unit Testing:</w:t>
+        <w:br/>
+        <w:t xml:space="preserve">    * 101/101 unit test suites passing cleanly in lifeos-server via native node:test</w:t>
+        <w:br/>
+        <w:t xml:space="preserve">    * Full suite execution in &lt; 5.0 seconds</w:t>
+        <w:br/>
+        <w:t xml:space="preserve">  - Compiler &amp; Lint Verifications:</w:t>
+        <w:br/>
+        <w:t xml:space="preserve">    * TypeScript strict mode build (tsc) in lifeos-server passing with 0 errors</w:t>
+        <w:br/>
+        <w:t xml:space="preserve">    * Next.js 16 (Turbopack) production build (next build) in lifeos-client compiling 24 static and dynamic routes with 0 errors</w:t>
+        <w:br/>
+        <w:t xml:space="preserve">    * Cleaned up all ESLint warnings, unused variables, and compiler constraints in lifeos-client and lifeos-server</w:t>
+        <w:br/>
+        <w:t xml:space="preserve">  - UI Testing:</w:t>
+        <w:br/>
+        <w:t xml:space="preserve">    * Loading states verified across all dashboard routes with animated pulse skeletons</w:t>
+        <w:br/>
+        <w:t xml:space="preserve">    * Empty states verified across all modules with informative, zero-fake data messages</w:t>
+        <w:br/>
+        <w:t xml:space="preserve">    * Error states and toast feedback handled cleanly</w:t>
+        <w:br/>
+        <w:t xml:space="preserve">  - Responsive &amp; Cross-Device Compatibility:</w:t>
+        <w:br/>
+        <w:t xml:space="preserve">    * Mobile, tablet, and desktop layouts verified with responsive grid breakpoints and collapsible navigation drawer</w:t>
+        <w:br/>
+        <w:t>Features Implemented: Full Regression Testing, ESLint Code Hygiene Resolution, Production Build Validation, Quality Assurance Sign-Off across all 18 functional modules.</w:t>
+        <w:br/>
+        <w:t>Files Modified: 10 files in lifeos-client for clean linting and React 19 compiler compatibility</w:t>
+        <w:br/>
+        <w:t>Tests Passed: 101/101 automated unit tests passing across Phases 1–19; client and server builds and lints passing cleanly with 0 errors</w:t>
+        <w:br/>
+        <w:t>Known Issues: None</w:t>
+        <w:br/>
+        <w:t>Decisions Made: Decision 026 - All TypeScript and ESLint warnings resolved in accordance with Rule: 'Bug fixes take priority over new features'; 101/101 automated tests passing green; codebase is production-ready for deployment</w:t>
+        <w:br/>
+        <w:t>Next Step: Phase 20 - Deployment (Production Environment Configurations, Docker/Containerization, Build Artifacts, Deployment Scripts)</w:t>
+        <w:br/>
+        <w:t>Overall Status: Phase 19 COMPLETED. Ready for Phase 20.</w:t>
       </w:r>
     </w:p>
     <w:sectPr/>

</xml_diff>